<commit_message>
Add Harmonogram table and convert objednavka template to named Word styles
Adds a sample Harmonogram tvorby webu table (Práce 1-5 / doba trvání) and
replaces all direct/manual formatting in the docx with reusable named
paragraph, character, and table styles (AITOM - ...) so future edits stay
consistent via Word's Styles panel instead of manual formatting.

Co-Authored-By: Claude Sonnet 5 <noreply@anthropic.com>
</commit_message>
<xml_diff>
--- a/docs/templates/objednavka/vzor-objednavka.docx
+++ b/docs/templates/objednavka/vzor-objednavka.docx
@@ -24,12 +24,6 @@
         <w:gridCol w:w="4000"/>
       </w:tblGrid>
       <w:tr>
-        <w:tblPrEx>
-          <w:tblCellMar>
-            <w:top w:w="0" w:type="dxa"/>
-            <w:bottom w:w="0" w:type="dxa"/>
-          </w:tblCellMar>
-        </w:tblPrEx>
         <w:tc>
           <w:tcPr>
             <w:tcW w:w="5600" w:type="dxa"/>
@@ -124,7 +118,7 @@
                 <w:sz w:val="15"/>
                 <w:szCs w:val="15"/>
               </w:rPr>
-              <w:t xml:space="preserve">OBJEDNÁVKA &amp; KALKULACE</w:t>
+              <w:t>OBJEDNÁVKA &amp; KALKULACE</w:t>
             </w:r>
           </w:p>
         </w:tc>
@@ -181,12 +175,6 @@
         <w:gridCol w:w="4703"/>
       </w:tblGrid>
       <w:tr>
-        <w:tblPrEx>
-          <w:tblCellMar>
-            <w:top w:w="0" w:type="dxa"/>
-            <w:bottom w:w="0" w:type="dxa"/>
-          </w:tblCellMar>
-        </w:tblPrEx>
         <w:tc>
           <w:tcPr>
             <w:tcW w:w="4800" w:type="dxa"/>
@@ -210,11 +198,7 @@
             </w:pPr>
             <w:r>
               <w:rPr>
-                <w:rFonts w:ascii="Space Grotesk SemiBold" w:eastAsia="Space Grotesk SemiBold" w:hAnsi="Space Grotesk SemiBold" w:cs="Space Grotesk SemiBold"/>
-                <w:color w:val="828482"/>
-                <w:spacing w:val="40"/>
-                <w:sz w:val="15"/>
-                <w:szCs w:val="15"/>
+                <w:rStyle w:val="AITOMLabelSvetly"/>
               </w:rPr>
               <w:t>ZHOTOVITEL</w:t>
             </w:r>
@@ -225,7 +209,7 @@
             </w:pPr>
             <w:r>
               <w:rPr>
-                <w:rFonts w:ascii="Inter SemiBold" w:eastAsia="Inter SemiBold" w:hAnsi="Inter SemiBold" w:cs="Inter SemiBold"/>
+                <w:rStyle w:val="AITOMDuraz"/>
               </w:rPr>
               <w:t>AITOM Digital s.r.o.</w:t>
             </w:r>
@@ -236,11 +220,9 @@
             </w:pPr>
             <w:r>
               <w:rPr>
-                <w:color w:val="828482"/>
-                <w:sz w:val="19"/>
-                <w:szCs w:val="19"/>
-              </w:rPr>
-              <w:t xml:space="preserve">Na Cihlářce 30</w:t>
+                <w:rStyle w:val="AITOMAdresa"/>
+              </w:rPr>
+              <w:t>Na Cihlářce 30</w:t>
             </w:r>
           </w:p>
           <w:p>
@@ -249,9 +231,7 @@
             </w:pPr>
             <w:r>
               <w:rPr>
-                <w:color w:val="828482"/>
-                <w:sz w:val="19"/>
-                <w:szCs w:val="19"/>
+                <w:rStyle w:val="AITOMAdresa"/>
               </w:rPr>
               <w:t>150 00 Praha 5</w:t>
             </w:r>
@@ -262,9 +242,7 @@
             </w:pPr>
             <w:r>
               <w:rPr>
-                <w:color w:val="828482"/>
-                <w:sz w:val="19"/>
-                <w:szCs w:val="19"/>
+                <w:rStyle w:val="AITOMAdresa"/>
               </w:rPr>
               <w:t>IČ: 24171816</w:t>
             </w:r>
@@ -275,9 +253,7 @@
             </w:pPr>
             <w:r>
               <w:rPr>
-                <w:color w:val="828482"/>
-                <w:sz w:val="19"/>
-                <w:szCs w:val="19"/>
+                <w:rStyle w:val="AITOMAdresa"/>
               </w:rPr>
               <w:t>DIČ: CZ24171816</w:t>
             </w:r>
@@ -318,11 +294,7 @@
             </w:pPr>
             <w:r>
               <w:rPr>
-                <w:rFonts w:ascii="Space Grotesk SemiBold" w:eastAsia="Space Grotesk SemiBold" w:hAnsi="Space Grotesk SemiBold" w:cs="Space Grotesk SemiBold"/>
-                <w:color w:val="828482"/>
-                <w:spacing w:val="40"/>
-                <w:sz w:val="15"/>
-                <w:szCs w:val="15"/>
+                <w:rStyle w:val="AITOMLabelSvetly"/>
               </w:rPr>
               <w:t>OBJEDNATEL</w:t>
             </w:r>
@@ -333,7 +305,7 @@
             </w:pPr>
             <w:r>
               <w:rPr>
-                <w:rFonts w:ascii="Inter SemiBold" w:eastAsia="Inter SemiBold" w:hAnsi="Inter SemiBold" w:cs="Inter SemiBold"/>
+                <w:rStyle w:val="AITOMDuraz"/>
               </w:rPr>
               <w:t>[Název klienta]</w:t>
             </w:r>
@@ -344,9 +316,7 @@
             </w:pPr>
             <w:r>
               <w:rPr>
-                <w:color w:val="828482"/>
-                <w:sz w:val="19"/>
-                <w:szCs w:val="19"/>
+                <w:rStyle w:val="AITOMAdresa"/>
               </w:rPr>
               <w:t>[Ulice a číslo]</w:t>
             </w:r>
@@ -357,9 +327,7 @@
             </w:pPr>
             <w:r>
               <w:rPr>
-                <w:color w:val="828482"/>
-                <w:sz w:val="19"/>
-                <w:szCs w:val="19"/>
+                <w:rStyle w:val="AITOMAdresa"/>
               </w:rPr>
               <w:t>[PSČ Město]</w:t>
             </w:r>
@@ -370,9 +338,7 @@
             </w:pPr>
             <w:r>
               <w:rPr>
-                <w:color w:val="828482"/>
-                <w:sz w:val="19"/>
-                <w:szCs w:val="19"/>
+                <w:rStyle w:val="AITOMAdresa"/>
               </w:rPr>
               <w:t>IČ: [xxxxxxxx]</w:t>
             </w:r>
@@ -383,9 +349,7 @@
             </w:pPr>
             <w:r>
               <w:rPr>
-                <w:color w:val="828482"/>
-                <w:sz w:val="19"/>
-                <w:szCs w:val="19"/>
+                <w:rStyle w:val="AITOMAdresa"/>
               </w:rPr>
               <w:t>DIČ: CZ[xxxxxxxx]</w:t>
             </w:r>
@@ -395,18 +359,9 @@
     </w:tbl>
     <w:p>
       <w:pPr>
-        <w:keepNext/>
-        <w:pBdr>
-          <w:bottom w:val="single" w:sz="14" w:space="6" w:color="4CE500"/>
-        </w:pBdr>
-        <w:spacing w:before="340" w:after="140"/>
-      </w:pPr>
-      <w:r>
-        <w:rPr>
-          <w:rFonts w:ascii="Space Grotesk SemiBold" w:eastAsia="Space Grotesk SemiBold" w:hAnsi="Space Grotesk SemiBold" w:cs="Space Grotesk SemiBold"/>
-          <w:sz w:val="30"/>
-          <w:szCs w:val="30"/>
-        </w:rPr>
+        <w:pStyle w:val="AITOMNadpisSekce"/>
+      </w:pPr>
+      <w:r>
         <w:t>Předmět objednávky</w:t>
       </w:r>
     </w:p>
@@ -420,18 +375,9 @@
     </w:p>
     <w:p>
       <w:pPr>
-        <w:keepNext/>
-        <w:pBdr>
-          <w:bottom w:val="single" w:sz="14" w:space="6" w:color="4CE500"/>
-        </w:pBdr>
-        <w:spacing w:before="340" w:after="140"/>
-      </w:pPr>
-      <w:r>
-        <w:rPr>
-          <w:rFonts w:ascii="Space Grotesk SemiBold" w:eastAsia="Space Grotesk SemiBold" w:hAnsi="Space Grotesk SemiBold" w:cs="Space Grotesk SemiBold"/>
-          <w:sz w:val="30"/>
-          <w:szCs w:val="30"/>
-        </w:rPr>
+        <w:pStyle w:val="AITOMNadpisSekce"/>
+      </w:pPr>
+      <w:r>
         <w:t>Smluvní cena</w:t>
       </w:r>
     </w:p>
@@ -444,40 +390,54 @@
       </w:r>
       <w:r>
         <w:rPr>
-          <w:rFonts w:ascii="Inter SemiBold" w:eastAsia="Inter SemiBold" w:hAnsi="Inter SemiBold" w:cs="Inter SemiBold"/>
+          <w:rStyle w:val="AITOMCastkaZvyraznena"/>
+        </w:rPr>
+        <w:t>0 Kč bez DPH</w:t>
+      </w:r>
+      <w:r>
+        <w:t xml:space="preserve"> za tvorbu webu, s možností navýšení až o </w:t>
+      </w:r>
+      <w:r>
+        <w:rPr>
+          <w:rStyle w:val="AITOMCastkaZvyraznena"/>
+        </w:rPr>
+        <w:t>0 Kč</w:t>
+      </w:r>
+      <w:r>
+        <w:t xml:space="preserve"> za copyediting / copywriting / tvorbu AI animací.</w:t>
+      </w:r>
+    </w:p>
+    <w:p>
+      <w:pPr>
+        <w:pStyle w:val="AITOMNadpisSekce"/>
+      </w:pPr>
+      <w:r>
+        <w:t>Termín realizace</w:t>
+      </w:r>
+    </w:p>
+    <w:p>
+      <w:pPr>
+        <w:spacing w:after="120" w:line="276" w:lineRule="auto"/>
+      </w:pPr>
+      <w:r>
+        <w:t xml:space="preserve">Předpokládaný termín dokončení prací je </w:t>
+      </w:r>
+      <w:r>
+        <w:rPr>
           <w:highlight w:val="yellow"/>
         </w:rPr>
-        <w:t>0 Kč bez DPH</w:t>
-      </w:r>
-      <w:r>
-        <w:t xml:space="preserve"> za tvorbu webu, s možností navýšení až o </w:t>
-      </w:r>
-      <w:r>
-        <w:rPr>
-          <w:rFonts w:ascii="Inter SemiBold" w:eastAsia="Inter SemiBold" w:hAnsi="Inter SemiBold" w:cs="Inter SemiBold"/>
-          <w:highlight w:val="yellow"/>
-        </w:rPr>
-        <w:t>0 Kč</w:t>
-      </w:r>
-      <w:r>
-        <w:t xml:space="preserve"> za copyediting / copywriting / tvorbu AI animací.</w:t>
+        <w:t>[DATUM]</w:t>
+      </w:r>
+      <w:r>
+        <w:t>. Termín závisí na součinnosti objednatele v průběhu projektu.</w:t>
       </w:r>
     </w:p>
     <w:p>
       <w:pPr>
-        <w:keepNext/>
-        <w:pBdr>
-          <w:bottom w:val="single" w:sz="14" w:space="6" w:color="4CE500"/>
-        </w:pBdr>
-        <w:spacing w:before="340" w:after="140"/>
-      </w:pPr>
-      <w:r>
-        <w:rPr>
-          <w:rFonts w:ascii="Space Grotesk SemiBold" w:eastAsia="Space Grotesk SemiBold" w:hAnsi="Space Grotesk SemiBold" w:cs="Space Grotesk SemiBold"/>
-          <w:sz w:val="30"/>
-          <w:szCs w:val="30"/>
-        </w:rPr>
-        <w:t>Termín realizace</w:t>
+        <w:pStyle w:val="AITOMNadpisSekce"/>
+      </w:pPr>
+      <w:r>
+        <w:t>Potvrzení objednávky a způsob fakturace</w:t>
       </w:r>
     </w:p>
     <w:p>
@@ -485,41 +445,7 @@
         <w:spacing w:after="120" w:line="276" w:lineRule="auto"/>
       </w:pPr>
       <w:r>
-        <w:t xml:space="preserve">Předpokládaný termín dokončení prací je </w:t>
-      </w:r>
-      <w:r>
-        <w:rPr>
-          <w:rFonts w:ascii="Inter SemiBold" w:eastAsia="Inter SemiBold" w:hAnsi="Inter SemiBold" w:cs="Inter SemiBold"/>
-        </w:rPr>
-        <w:t>19–23 týdnů</w:t>
-      </w:r>
-      <w:r>
-        <w:t xml:space="preserve"> od podpisu objednávky. Termín závisí na součinnosti objednatele v průběhu projektu.</w:t>
-      </w:r>
-    </w:p>
-    <w:p>
-      <w:pPr>
-        <w:keepNext/>
-        <w:pBdr>
-          <w:bottom w:val="single" w:sz="14" w:space="6" w:color="4CE500"/>
-        </w:pBdr>
-        <w:spacing w:before="340" w:after="140"/>
-      </w:pPr>
-      <w:r>
-        <w:rPr>
-          <w:rFonts w:ascii="Space Grotesk SemiBold" w:eastAsia="Space Grotesk SemiBold" w:hAnsi="Space Grotesk SemiBold" w:cs="Space Grotesk SemiBold"/>
-          <w:sz w:val="30"/>
-          <w:szCs w:val="30"/>
-        </w:rPr>
-        <w:t>Potvrzení objednávky a způsob fakturace</w:t>
-      </w:r>
-    </w:p>
-    <w:p>
-      <w:pPr>
-        <w:spacing w:after="120" w:line="276" w:lineRule="auto"/>
-      </w:pPr>
-      <w:r>
-        <w:t>Potvrzení této objednávky bude provedeno jejím podpisem a úhradou první faktury objednatelem. Fakturace bude probíhat ve 3 fázích v níže uvedených termínech:</w:t>
+        <w:t xml:space="preserve">Potvrzení této objednávky bude provedeno jejím podpisem a úhradou první faktury objednatelem. Fakturace bude probíhat ve 2 fázích v níže uvedených termínech:</w:t>
       </w:r>
     </w:p>
     <w:p>
@@ -536,8 +462,7 @@
       </w:r>
       <w:r>
         <w:rPr>
-          <w:rFonts w:ascii="Inter SemiBold" w:eastAsia="Inter SemiBold" w:hAnsi="Inter SemiBold" w:cs="Inter SemiBold"/>
-          <w:highlight w:val="yellow"/>
+          <w:rStyle w:val="AITOMCastkaZvyraznena"/>
         </w:rPr>
         <w:t>0 Kč bez DPH</w:t>
       </w:r>
@@ -554,36 +479,6 @@
       <w:r>
         <w:t>Doplatek ve výši celkové konečné částky se započtením uhrazené zálohy a případných změnových požadavků po předání projektu.</w:t>
       </w:r>
-    </w:p>
-    <w:p>
-      <w:pPr>
-        <w:pStyle w:val="Odstavecseseznamem"/>
-        <w:numPr>
-          <w:ilvl w:val="0"/>
-          <w:numId w:val="2"/>
-        </w:numPr>
-        <w:spacing w:after="70" w:line="268" w:lineRule="auto"/>
-      </w:pPr>
-      <w:r>
-        <w:t xml:space="preserve">Platba dle reálných prací na copywritingu / copyeditingu / tvorbě AI animací až do max. výše </w:t>
-      </w:r>
-      <w:r>
-        <w:rPr>
-          <w:rFonts w:ascii="Inter SemiBold" w:eastAsia="Inter SemiBold" w:hAnsi="Inter SemiBold" w:cs="Inter SemiBold"/>
-          <w:highlight w:val="yellow"/>
-        </w:rPr>
-        <w:t>0 Kč</w:t>
-      </w:r>
-      <w:r>
-        <w:t xml:space="preserve"> po spuštění projektu.</w:t>
-      </w:r>
-    </w:p>
-    <w:p>
-      <w:pPr>
-        <w:pStyle w:val="Odstavecseseznamem"/>
-        <w:spacing w:after="70" w:line="268" w:lineRule="auto"/>
-        <w:ind w:left="340"/>
-      </w:pPr>
     </w:p>
     <w:tbl>
       <w:tblPr>
@@ -603,17 +498,11 @@
         <w:tblLook w:val="04A0" w:firstRow="1" w:lastRow="0" w:firstColumn="1" w:lastColumn="0" w:noHBand="0" w:noVBand="1"/>
       </w:tblPr>
       <w:tblGrid>
-        <w:gridCol w:w="4703"/>
+        <w:gridCol w:w="4506"/>
         <w:gridCol w:w="200"/>
-        <w:gridCol w:w="4697"/>
+        <w:gridCol w:w="4894"/>
       </w:tblGrid>
       <w:tr>
-        <w:tblPrEx>
-          <w:tblCellMar>
-            <w:top w:w="0" w:type="dxa"/>
-            <w:bottom w:w="0" w:type="dxa"/>
-          </w:tblCellMar>
-        </w:tblPrEx>
         <w:tc>
           <w:tcPr>
             <w:tcW w:w="0" w:type="auto"/>
@@ -633,7 +522,13 @@
               <w:spacing w:after="60"/>
             </w:pPr>
             <w:r>
-              <w:t>V Praze dne [DATUM]</w:t>
+              <w:t xml:space="preserve">V Praze dne </w:t>
+            </w:r>
+            <w:r>
+              <w:rPr>
+                <w:highlight w:val="yellow"/>
+              </w:rPr>
+              <w:t>[DATUM]</w:t>
             </w:r>
           </w:p>
           <w:p>
@@ -702,16 +597,13 @@
     </w:tbl>
     <w:p>
       <w:pPr>
+        <w:pStyle w:val="AITOMLabelSvetly"/>
         <w:pageBreakBefore/>
         <w:spacing w:after="40"/>
       </w:pPr>
       <w:r>
         <w:rPr>
-          <w:rFonts w:ascii="Space Grotesk SemiBold" w:eastAsia="Space Grotesk SemiBold" w:hAnsi="Space Grotesk SemiBold" w:cs="Space Grotesk SemiBold"/>
-          <w:color w:val="828482"/>
-          <w:spacing w:val="30"/>
-          <w:sz w:val="15"/>
-          <w:szCs w:val="15"/>
+          <w:rStyle w:val="AITOMLabelSvetly"/>
         </w:rPr>
         <w:lastRenderedPageBreak/>
         <w:t>PŘÍLOHA Č. 1</w:t>
@@ -719,19 +611,9 @@
     </w:p>
     <w:p>
       <w:pPr>
-        <w:pBdr>
-          <w:bottom w:val="single" w:sz="14" w:space="6" w:color="4CE500"/>
-        </w:pBdr>
-        <w:spacing w:after="60"/>
-      </w:pPr>
-      <w:r>
-        <w:rPr>
-          <w:rFonts w:ascii="Space Grotesk" w:eastAsia="Space Grotesk" w:hAnsi="Space Grotesk" w:cs="Space Grotesk"/>
-          <w:b/>
-          <w:bCs/>
-          <w:sz w:val="40"/>
-          <w:szCs w:val="40"/>
-        </w:rPr>
+        <w:pStyle w:val="AITOMNadpisPriloha"/>
+      </w:pPr>
+      <w:r>
         <w:t>Kalkulace tvorby webu</w:t>
       </w:r>
     </w:p>
@@ -740,23 +622,17 @@
         <w:spacing w:before="160" w:after="200"/>
       </w:pPr>
       <w:r>
-        <w:t xml:space="preserve">Podklady: </w:t>
-      </w:r>
-      <w:r>
-        <w:rPr>
-          <w:rFonts w:ascii="Inter Medium" w:eastAsia="Inter Medium" w:hAnsi="Inter Medium" w:cs="Inter Medium"/>
-        </w:rPr>
-        <w:t>Struktura webu</w:t>
+        <w:t xml:space="preserve">Lorem Ipsum odkaz bude doplněn</w:t>
       </w:r>
       <w:r>
         <w:rPr>
           <w:color w:val="828482"/>
         </w:rPr>
-        <w:t xml:space="preserve"> — odkaz bude doplněn   ·   </w:t>
+        <w:t xml:space="preserve">   ·   </w:t>
       </w:r>
       <w:r>
         <w:rPr>
-          <w:rFonts w:ascii="Inter Medium" w:eastAsia="Inter Medium" w:hAnsi="Inter Medium" w:cs="Inter Medium"/>
+          <w:rStyle w:val="AITOMOdkaz"/>
         </w:rPr>
         <w:t xml:space="preserve">Wireframe webu</w:t>
       </w:r>
@@ -769,15 +645,9 @@
     </w:p>
     <w:p>
       <w:pPr>
-        <w:keepNext/>
-        <w:spacing w:before="220" w:after="90"/>
-      </w:pPr>
-      <w:r>
-        <w:rPr>
-          <w:rFonts w:ascii="Space Grotesk SemiBold" w:eastAsia="Space Grotesk SemiBold" w:hAnsi="Space Grotesk SemiBold" w:cs="Space Grotesk SemiBold"/>
-          <w:sz w:val="23"/>
-          <w:szCs w:val="23"/>
-        </w:rPr>
+        <w:pStyle w:val="AITOMNadpisPodsekce"/>
+      </w:pPr>
+      <w:r>
         <w:t>Kalkulace navrhovaného řešení</w:t>
       </w:r>
     </w:p>
@@ -803,12 +673,6 @@
         <w:gridCol w:w="2300"/>
       </w:tblGrid>
       <w:tr>
-        <w:tblPrEx>
-          <w:tblCellMar>
-            <w:top w:w="0" w:type="dxa"/>
-            <w:bottom w:w="0" w:type="dxa"/>
-          </w:tblCellMar>
-        </w:tblPrEx>
         <w:trPr>
           <w:tblHeader/>
         </w:trPr>
@@ -833,11 +697,7 @@
           <w:p>
             <w:r>
               <w:rPr>
-                <w:rFonts w:ascii="Space Grotesk SemiBold" w:eastAsia="Space Grotesk SemiBold" w:hAnsi="Space Grotesk SemiBold" w:cs="Space Grotesk SemiBold"/>
-                <w:color w:val="FFFFFF"/>
-                <w:spacing w:val="20"/>
-                <w:sz w:val="19"/>
-                <w:szCs w:val="19"/>
+                <w:rStyle w:val="AITOMLabelTmavy"/>
               </w:rPr>
               <w:t>POLOŽKA</w:t>
             </w:r>
@@ -867,11 +727,7 @@
             </w:pPr>
             <w:r>
               <w:rPr>
-                <w:rFonts w:ascii="Space Grotesk SemiBold" w:eastAsia="Space Grotesk SemiBold" w:hAnsi="Space Grotesk SemiBold" w:cs="Space Grotesk SemiBold"/>
-                <w:color w:val="FFFFFF"/>
-                <w:spacing w:val="20"/>
-                <w:sz w:val="19"/>
-                <w:szCs w:val="19"/>
+                <w:rStyle w:val="AITOMLabelTmavy"/>
               </w:rPr>
               <w:t>CENA</w:t>
             </w:r>
@@ -879,12 +735,6 @@
         </w:tc>
       </w:tr>
       <w:tr>
-        <w:tblPrEx>
-          <w:tblCellMar>
-            <w:top w:w="0" w:type="dxa"/>
-            <w:bottom w:w="0" w:type="dxa"/>
-          </w:tblCellMar>
-        </w:tblPrEx>
         <w:tc>
           <w:tcPr>
             <w:tcW w:w="7300" w:type="dxa"/>
@@ -908,120 +758,43 @@
             </w:pPr>
             <w:r>
               <w:rPr>
-                <w:rFonts w:ascii="Inter SemiBold" w:eastAsia="Inter SemiBold" w:hAnsi="Inter SemiBold" w:cs="Inter SemiBold"/>
-              </w:rPr>
-              <w:t>Design webu</w:t>
+                <w:rStyle w:val="AITOMDuraz"/>
+              </w:rPr>
+              <w:t>Položka 1</w:t>
+            </w:r>
+          </w:p>
+          <w:p>
+            <w:pPr>
+              <w:pStyle w:val="AITOMOdrazkaSeznam"/>
+            </w:pPr>
+            <w:r>
+              <w:rPr>
+                <w:rStyle w:val="AITOMOdrazkaText"/>
+              </w:rPr>
+              <w:t xml:space="preserve">subitem 1</w:t>
+            </w:r>
+          </w:p>
+          <w:p>
+            <w:pPr>
+              <w:pStyle w:val="AITOMOdrazkaSeznam"/>
+            </w:pPr>
+            <w:r>
+              <w:rPr>
+                <w:rStyle w:val="AITOMOdrazkaText"/>
+              </w:rPr>
+              <w:t xml:space="preserve">subitem 2</w:t>
             </w:r>
           </w:p>
           <w:p>
             <w:pPr>
               <w:spacing w:after="26"/>
               <w:ind w:left="170" w:hanging="170"/>
-            </w:pPr>
-            <w:r>
-              <w:rPr>
-                <w:color w:val="4CE500"/>
-                <w:sz w:val="17"/>
-                <w:szCs w:val="17"/>
-              </w:rPr>
-              <w:t xml:space="preserve">–  </w:t>
-            </w:r>
-            <w:r>
               <w:rPr>
                 <w:color w:val="828482"/>
                 <w:sz w:val="17"/>
                 <w:szCs w:val="17"/>
               </w:rPr>
-              <w:t xml:space="preserve">Šablony: [X] unikátních podstránek (např. Homepage, O nás, Služby – kategorie i detail, Reference, Kontakt, ...)</w:t>
-            </w:r>
-          </w:p>
-          <w:p>
-            <w:pPr>
-              <w:spacing w:after="26"/>
-              <w:ind w:left="170" w:hanging="170"/>
-            </w:pPr>
-            <w:r>
-              <w:rPr>
-                <w:color w:val="4CE500"/>
-                <w:sz w:val="17"/>
-                <w:szCs w:val="17"/>
-              </w:rPr>
-              <w:t xml:space="preserve">–  </w:t>
-            </w:r>
-            <w:r>
-              <w:rPr>
-                <w:color w:val="828482"/>
-                <w:sz w:val="17"/>
-                <w:szCs w:val="17"/>
-              </w:rPr>
-              <w:t>Desktop u všech šablon</w:t>
-            </w:r>
-          </w:p>
-          <w:p>
-            <w:pPr>
-              <w:spacing w:after="26"/>
-              <w:ind w:left="170" w:hanging="170"/>
-            </w:pPr>
-            <w:r>
-              <w:rPr>
-                <w:color w:val="4CE500"/>
-                <w:sz w:val="17"/>
-                <w:szCs w:val="17"/>
-              </w:rPr>
-              <w:t xml:space="preserve">–  </w:t>
-            </w:r>
-            <w:r>
-              <w:rPr>
-                <w:color w:val="828482"/>
-                <w:sz w:val="17"/>
-                <w:szCs w:val="17"/>
-              </w:rPr>
-              <w:t>Mobil u vybraných šablon / prvků, které jsou na mobilu specifické</w:t>
-            </w:r>
-          </w:p>
-          <w:p>
-            <w:pPr>
-              <w:spacing w:after="26"/>
-              <w:ind w:left="170" w:hanging="170"/>
-            </w:pPr>
-            <w:r>
-              <w:rPr>
-                <w:color w:val="4CE500"/>
-                <w:sz w:val="17"/>
-                <w:szCs w:val="17"/>
-              </w:rPr>
-              <w:t xml:space="preserve">–  </w:t>
-            </w:r>
-            <w:r>
-              <w:rPr>
-                <w:color w:val="828482"/>
-                <w:sz w:val="17"/>
-                <w:szCs w:val="17"/>
-              </w:rPr>
-              <w:t xml:space="preserve">Tvorba StyleGuide pro další stránky / prvky</w:t>
-            </w:r>
-          </w:p>
-          <w:p>
-            <w:pPr>
-              <w:spacing w:after="26"/>
-              <w:ind w:left="170" w:hanging="170"/>
-            </w:pPr>
-            <w:r>
-              <w:rPr>
-                <w:color w:val="4CE500"/>
-                <w:sz w:val="17"/>
-                <w:szCs w:val="17"/>
-              </w:rPr>
-              <w:t xml:space="preserve">–  </w:t>
-            </w:r>
-            <w:r>
-              <w:rPr>
-                <w:color w:val="828482"/>
-                <w:sz w:val="17"/>
-                <w:szCs w:val="17"/>
-              </w:rPr>
-              <w:t>Max. 2 kola iterací</w:t>
-            </w:r>
+            </w:pPr>
           </w:p>
         </w:tc>
         <w:tc>
@@ -1047,8 +820,7 @@
             </w:pPr>
             <w:r>
               <w:rPr>
-                <w:rFonts w:ascii="Inter SemiBold" w:eastAsia="Inter SemiBold" w:hAnsi="Inter SemiBold" w:cs="Inter SemiBold"/>
-                <w:highlight w:val="yellow"/>
+                <w:rStyle w:val="AITOMCastkaZvyraznena"/>
               </w:rPr>
               <w:t>0 Kč</w:t>
             </w:r>
@@ -1056,12 +828,6 @@
         </w:tc>
       </w:tr>
       <w:tr>
-        <w:tblPrEx>
-          <w:tblCellMar>
-            <w:top w:w="0" w:type="dxa"/>
-            <w:bottom w:w="0" w:type="dxa"/>
-          </w:tblCellMar>
-        </w:tblPrEx>
         <w:tc>
           <w:tcPr>
             <w:tcW w:w="7300" w:type="dxa"/>
@@ -1085,120 +851,37 @@
             </w:pPr>
             <w:r>
               <w:rPr>
-                <w:rFonts w:ascii="Inter SemiBold" w:eastAsia="Inter SemiBold" w:hAnsi="Inter SemiBold" w:cs="Inter SemiBold"/>
-              </w:rPr>
-              <w:t>Front-end development</w:t>
-            </w:r>
-          </w:p>
-          <w:p>
-            <w:pPr>
-              <w:spacing w:after="26"/>
-              <w:ind w:left="170" w:hanging="170"/>
-            </w:pPr>
-            <w:r>
-              <w:rPr>
-                <w:color w:val="4CE500"/>
-                <w:sz w:val="17"/>
-                <w:szCs w:val="17"/>
-              </w:rPr>
-              <w:t xml:space="preserve">–  </w:t>
-            </w:r>
-            <w:r>
-              <w:rPr>
-                <w:color w:val="828482"/>
-                <w:sz w:val="17"/>
-                <w:szCs w:val="17"/>
-              </w:rPr>
-              <w:t>Šablony: [X] unikátních podstránek</w:t>
-            </w:r>
-          </w:p>
-          <w:p>
-            <w:pPr>
-              <w:spacing w:after="26"/>
-              <w:ind w:left="170" w:hanging="170"/>
-            </w:pPr>
-            <w:r>
-              <w:rPr>
-                <w:color w:val="4CE500"/>
-                <w:sz w:val="17"/>
-                <w:szCs w:val="17"/>
-              </w:rPr>
-              <w:t xml:space="preserve">–  </w:t>
-            </w:r>
-            <w:r>
-              <w:rPr>
-                <w:color w:val="828482"/>
-                <w:sz w:val="17"/>
-                <w:szCs w:val="17"/>
-              </w:rPr>
-              <w:t xml:space="preserve">V ceně počítáme se základními efekty (hover, zoom, apod.)</w:t>
-            </w:r>
-          </w:p>
-          <w:p>
-            <w:pPr>
-              <w:spacing w:after="26"/>
-              <w:ind w:left="170" w:hanging="170"/>
-            </w:pPr>
-            <w:r>
-              <w:rPr>
-                <w:color w:val="4CE500"/>
-                <w:sz w:val="17"/>
-                <w:szCs w:val="17"/>
-              </w:rPr>
-              <w:t xml:space="preserve">–  </w:t>
-            </w:r>
-            <w:r>
-              <w:rPr>
-                <w:color w:val="828482"/>
-                <w:sz w:val="17"/>
-                <w:szCs w:val="17"/>
-              </w:rPr>
-              <w:t>V ceně není tvorba animací a vizualizací – jedná se o samostatnou položku (viz níže)</w:t>
-            </w:r>
-          </w:p>
-          <w:p>
-            <w:pPr>
-              <w:spacing w:after="26"/>
-              <w:ind w:left="170" w:hanging="170"/>
-            </w:pPr>
-            <w:r>
-              <w:rPr>
-                <w:color w:val="4CE500"/>
-                <w:sz w:val="17"/>
-                <w:szCs w:val="17"/>
-              </w:rPr>
-              <w:t xml:space="preserve">–  </w:t>
-            </w:r>
-            <w:r>
-              <w:rPr>
-                <w:color w:val="828482"/>
-                <w:sz w:val="17"/>
-                <w:szCs w:val="17"/>
-              </w:rPr>
-              <w:t>Responzivní zobrazení</w:t>
-            </w:r>
-          </w:p>
-          <w:p>
-            <w:pPr>
-              <w:spacing w:after="26"/>
-              <w:ind w:left="170" w:hanging="170"/>
-            </w:pPr>
-            <w:r>
-              <w:rPr>
-                <w:color w:val="4CE500"/>
-                <w:sz w:val="17"/>
-                <w:szCs w:val="17"/>
-              </w:rPr>
-              <w:t xml:space="preserve">–  </w:t>
-            </w:r>
-            <w:r>
-              <w:rPr>
-                <w:color w:val="828482"/>
-                <w:sz w:val="17"/>
-                <w:szCs w:val="17"/>
-              </w:rPr>
-              <w:t>Max. 2 kola iterací</w:t>
-            </w:r>
+                <w:rStyle w:val="AITOMDuraz"/>
+              </w:rPr>
+              <w:t>Položka 2</w:t>
+            </w:r>
+          </w:p>
+          <w:p>
+            <w:pPr>
+              <w:pStyle w:val="AITOMOdrazkaSeznam"/>
+            </w:pPr>
+            <w:r>
+              <w:rPr>
+                <w:rStyle w:val="AITOMOdrazkaText"/>
+              </w:rPr>
+              <w:t xml:space="preserve">subitem 1</w:t>
+            </w:r>
+          </w:p>
+          <w:p>
+            <w:pPr>
+              <w:pStyle w:val="AITOMOdrazkaSeznam"/>
+            </w:pPr>
+            <w:r>
+              <w:rPr>
+                <w:rStyle w:val="AITOMOdrazkaText"/>
+              </w:rPr>
+              <w:t xml:space="preserve">subitem 2</w:t>
+            </w:r>
+          </w:p>
+          <w:p>
+            <w:pPr>
+              <w:pStyle w:val="AITOMOdrazkaPolozky"/>
+            </w:pPr>
           </w:p>
         </w:tc>
         <w:tc>
@@ -1224,8 +907,7 @@
             </w:pPr>
             <w:r>
               <w:rPr>
-                <w:rFonts w:ascii="Inter SemiBold" w:eastAsia="Inter SemiBold" w:hAnsi="Inter SemiBold" w:cs="Inter SemiBold"/>
-                <w:highlight w:val="yellow"/>
+                <w:rStyle w:val="AITOMCastkaZvyraznena"/>
               </w:rPr>
               <w:t>0 Kč</w:t>
             </w:r>
@@ -1233,899 +915,6 @@
         </w:tc>
       </w:tr>
       <w:tr>
-        <w:tblPrEx>
-          <w:tblCellMar>
-            <w:top w:w="0" w:type="dxa"/>
-            <w:bottom w:w="0" w:type="dxa"/>
-          </w:tblCellMar>
-        </w:tblPrEx>
-        <w:tc>
-          <w:tcPr>
-            <w:tcW w:w="7300" w:type="dxa"/>
-            <w:tcBorders>
-              <w:top w:val="single" w:sz="4" w:space="0" w:color="E4E6E4"/>
-              <w:left w:val="none" w:sz="0" w:space="0" w:color="FFFFFF"/>
-              <w:bottom w:val="single" w:sz="4" w:space="0" w:color="E4E6E4"/>
-              <w:right w:val="none" w:sz="0" w:space="0" w:color="FFFFFF"/>
-            </w:tcBorders>
-            <w:shd w:val="clear" w:color="auto" w:fill="FFFFFF"/>
-            <w:tcMar>
-              <w:top w:w="150" w:type="dxa"/>
-              <w:left w:w="200" w:type="dxa"/>
-              <w:bottom w:w="150" w:type="dxa"/>
-              <w:right w:w="160" w:type="dxa"/>
-            </w:tcMar>
-          </w:tcPr>
-          <w:p>
-            <w:pPr>
-              <w:spacing w:after="80"/>
-            </w:pPr>
-            <w:r>
-              <w:rPr>
-                <w:rFonts w:ascii="Inter SemiBold" w:eastAsia="Inter SemiBold" w:hAnsi="Inter SemiBold" w:cs="Inter SemiBold"/>
-              </w:rPr>
-              <w:t>Back-end development</w:t>
-            </w:r>
-          </w:p>
-          <w:p>
-            <w:pPr>
-              <w:spacing w:after="26"/>
-              <w:ind w:left="170" w:hanging="170"/>
-            </w:pPr>
-            <w:r>
-              <w:rPr>
-                <w:color w:val="4CE500"/>
-                <w:sz w:val="17"/>
-                <w:szCs w:val="17"/>
-              </w:rPr>
-              <w:t xml:space="preserve">–  </w:t>
-            </w:r>
-            <w:r>
-              <w:rPr>
-                <w:color w:val="828482"/>
-                <w:sz w:val="17"/>
-                <w:szCs w:val="17"/>
-              </w:rPr>
-              <w:t>V tuto chvíli nepočítáme s funkcemi na míru a/nebo napojením na ATS / CRM</w:t>
-            </w:r>
-          </w:p>
-          <w:p>
-            <w:pPr>
-              <w:spacing w:after="26"/>
-              <w:ind w:left="170" w:hanging="170"/>
-            </w:pPr>
-            <w:r>
-              <w:rPr>
-                <w:color w:val="4CE500"/>
-                <w:sz w:val="17"/>
-                <w:szCs w:val="17"/>
-              </w:rPr>
-              <w:t xml:space="preserve">–  </w:t>
-            </w:r>
-            <w:r>
-              <w:rPr>
-                <w:color w:val="828482"/>
-                <w:sz w:val="17"/>
-                <w:szCs w:val="17"/>
-              </w:rPr>
-              <w:t>Možnost naprogramovat v budoucnu (nyní není součástí nabídky)</w:t>
-            </w:r>
-          </w:p>
-        </w:tc>
-        <w:tc>
-          <w:tcPr>
-            <w:tcW w:w="2300" w:type="dxa"/>
-            <w:tcBorders>
-              <w:top w:val="single" w:sz="4" w:space="0" w:color="E4E6E4"/>
-              <w:left w:val="none" w:sz="0" w:space="0" w:color="FFFFFF"/>
-              <w:bottom w:val="single" w:sz="4" w:space="0" w:color="E4E6E4"/>
-              <w:right w:val="none" w:sz="0" w:space="0" w:color="FFFFFF"/>
-            </w:tcBorders>
-            <w:shd w:val="clear" w:color="auto" w:fill="FFFFFF"/>
-            <w:tcMar>
-              <w:top w:w="150" w:type="dxa"/>
-              <w:left w:w="120" w:type="dxa"/>
-              <w:bottom w:w="150" w:type="dxa"/>
-              <w:right w:w="200" w:type="dxa"/>
-            </w:tcMar>
-          </w:tcPr>
-          <w:p>
-            <w:pPr>
-              <w:jc w:val="right"/>
-            </w:pPr>
-            <w:r>
-              <w:rPr>
-                <w:rFonts w:ascii="Inter SemiBold" w:eastAsia="Inter SemiBold" w:hAnsi="Inter SemiBold" w:cs="Inter SemiBold"/>
-              </w:rPr>
-              <w:t>0 Kč</w:t>
-            </w:r>
-          </w:p>
-        </w:tc>
-      </w:tr>
-      <w:tr>
-        <w:tblPrEx>
-          <w:tblCellMar>
-            <w:top w:w="0" w:type="dxa"/>
-            <w:bottom w:w="0" w:type="dxa"/>
-          </w:tblCellMar>
-        </w:tblPrEx>
-        <w:tc>
-          <w:tcPr>
-            <w:tcW w:w="7300" w:type="dxa"/>
-            <w:tcBorders>
-              <w:top w:val="single" w:sz="4" w:space="0" w:color="E4E6E4"/>
-              <w:left w:val="none" w:sz="0" w:space="0" w:color="FFFFFF"/>
-              <w:bottom w:val="single" w:sz="4" w:space="0" w:color="E4E6E4"/>
-              <w:right w:val="none" w:sz="0" w:space="0" w:color="FFFFFF"/>
-            </w:tcBorders>
-            <w:shd w:val="clear" w:color="auto" w:fill="F8FAF8"/>
-            <w:tcMar>
-              <w:top w:w="150" w:type="dxa"/>
-              <w:left w:w="200" w:type="dxa"/>
-              <w:bottom w:w="150" w:type="dxa"/>
-              <w:right w:w="160" w:type="dxa"/>
-            </w:tcMar>
-          </w:tcPr>
-          <w:p>
-            <w:pPr>
-              <w:spacing w:after="80"/>
-            </w:pPr>
-            <w:r>
-              <w:rPr>
-                <w:rFonts w:ascii="Inter SemiBold" w:eastAsia="Inter SemiBold" w:hAnsi="Inter SemiBold" w:cs="Inter SemiBold"/>
-              </w:rPr>
-              <w:t>Licence CMS systému AITOM CMS 5</w:t>
-            </w:r>
-          </w:p>
-          <w:p>
-            <w:pPr>
-              <w:spacing w:after="26"/>
-              <w:ind w:left="170" w:hanging="170"/>
-            </w:pPr>
-            <w:r>
-              <w:rPr>
-                <w:color w:val="4CE500"/>
-                <w:sz w:val="17"/>
-                <w:szCs w:val="17"/>
-              </w:rPr>
-              <w:t xml:space="preserve">–  </w:t>
-            </w:r>
-            <w:r>
-              <w:rPr>
-                <w:color w:val="828482"/>
-                <w:sz w:val="17"/>
-                <w:szCs w:val="17"/>
-              </w:rPr>
-              <w:t>CMS systém pro správu obsahu</w:t>
-            </w:r>
-          </w:p>
-          <w:p>
-            <w:pPr>
-              <w:spacing w:after="26"/>
-              <w:ind w:left="170" w:hanging="170"/>
-            </w:pPr>
-            <w:r>
-              <w:rPr>
-                <w:color w:val="4CE500"/>
-                <w:sz w:val="17"/>
-                <w:szCs w:val="17"/>
-              </w:rPr>
-              <w:t xml:space="preserve">–  </w:t>
-            </w:r>
-            <w:r>
-              <w:rPr>
-                <w:color w:val="828482"/>
-                <w:sz w:val="17"/>
-                <w:szCs w:val="17"/>
-              </w:rPr>
-              <w:t>Časově neomezené používání, jednorázová platba</w:t>
-            </w:r>
-          </w:p>
-        </w:tc>
-        <w:tc>
-          <w:tcPr>
-            <w:tcW w:w="2300" w:type="dxa"/>
-            <w:tcBorders>
-              <w:top w:val="single" w:sz="4" w:space="0" w:color="E4E6E4"/>
-              <w:left w:val="none" w:sz="0" w:space="0" w:color="FFFFFF"/>
-              <w:bottom w:val="single" w:sz="4" w:space="0" w:color="E4E6E4"/>
-              <w:right w:val="none" w:sz="0" w:space="0" w:color="FFFFFF"/>
-            </w:tcBorders>
-            <w:shd w:val="clear" w:color="auto" w:fill="F8FAF8"/>
-            <w:tcMar>
-              <w:top w:w="150" w:type="dxa"/>
-              <w:left w:w="120" w:type="dxa"/>
-              <w:bottom w:w="150" w:type="dxa"/>
-              <w:right w:w="200" w:type="dxa"/>
-            </w:tcMar>
-          </w:tcPr>
-          <w:p>
-            <w:pPr>
-              <w:jc w:val="right"/>
-            </w:pPr>
-            <w:r>
-              <w:rPr>
-                <w:rFonts w:ascii="Inter SemiBold" w:eastAsia="Inter SemiBold" w:hAnsi="Inter SemiBold" w:cs="Inter SemiBold"/>
-                <w:highlight w:val="yellow"/>
-              </w:rPr>
-              <w:t>0 Kč</w:t>
-            </w:r>
-          </w:p>
-        </w:tc>
-      </w:tr>
-      <w:tr>
-        <w:tblPrEx>
-          <w:tblCellMar>
-            <w:top w:w="0" w:type="dxa"/>
-            <w:bottom w:w="0" w:type="dxa"/>
-          </w:tblCellMar>
-        </w:tblPrEx>
-        <w:tc>
-          <w:tcPr>
-            <w:tcW w:w="7300" w:type="dxa"/>
-            <w:tcBorders>
-              <w:top w:val="single" w:sz="4" w:space="0" w:color="E4E6E4"/>
-              <w:left w:val="none" w:sz="0" w:space="0" w:color="FFFFFF"/>
-              <w:bottom w:val="single" w:sz="4" w:space="0" w:color="E4E6E4"/>
-              <w:right w:val="none" w:sz="0" w:space="0" w:color="FFFFFF"/>
-            </w:tcBorders>
-            <w:shd w:val="clear" w:color="auto" w:fill="FFFFFF"/>
-            <w:tcMar>
-              <w:top w:w="150" w:type="dxa"/>
-              <w:left w:w="200" w:type="dxa"/>
-              <w:bottom w:w="150" w:type="dxa"/>
-              <w:right w:w="160" w:type="dxa"/>
-            </w:tcMar>
-          </w:tcPr>
-          <w:p>
-            <w:pPr>
-              <w:spacing w:after="80"/>
-            </w:pPr>
-            <w:r>
-              <w:rPr>
-                <w:rFonts w:ascii="Inter SemiBold" w:eastAsia="Inter SemiBold" w:hAnsi="Inter SemiBold" w:cs="Inter SemiBold"/>
-              </w:rPr>
-              <w:t>Práce s obsahem webu</w:t>
-            </w:r>
-          </w:p>
-          <w:p>
-            <w:pPr>
-              <w:spacing w:after="26"/>
-              <w:ind w:left="170" w:hanging="170"/>
-            </w:pPr>
-            <w:r>
-              <w:rPr>
-                <w:color w:val="4CE500"/>
-                <w:sz w:val="17"/>
-                <w:szCs w:val="17"/>
-              </w:rPr>
-              <w:t xml:space="preserve">–  </w:t>
-            </w:r>
-            <w:r>
-              <w:rPr>
-                <w:color w:val="828482"/>
-                <w:sz w:val="17"/>
-                <w:szCs w:val="17"/>
-              </w:rPr>
-              <w:t xml:space="preserve">Obsah dodává klient (texty, fotky, atd.); pokud my, jedná se o samostatnou položku (viz níže)</w:t>
-            </w:r>
-          </w:p>
-          <w:p>
-            <w:pPr>
-              <w:spacing w:after="26"/>
-              <w:ind w:left="170" w:hanging="170"/>
-            </w:pPr>
-            <w:r>
-              <w:rPr>
-                <w:color w:val="4CE500"/>
-                <w:sz w:val="17"/>
-                <w:szCs w:val="17"/>
-              </w:rPr>
-              <w:t xml:space="preserve">–  </w:t>
-            </w:r>
-            <w:r>
-              <w:rPr>
-                <w:color w:val="828482"/>
-                <w:sz w:val="17"/>
-                <w:szCs w:val="17"/>
-              </w:rPr>
-              <w:t>Plnění obsahu webu: [X] web-stran</w:t>
-            </w:r>
-          </w:p>
-          <w:p>
-            <w:pPr>
-              <w:spacing w:after="26"/>
-              <w:ind w:left="170" w:hanging="170"/>
-            </w:pPr>
-            <w:r>
-              <w:rPr>
-                <w:color w:val="4CE500"/>
-                <w:sz w:val="17"/>
-                <w:szCs w:val="17"/>
-              </w:rPr>
-              <w:t xml:space="preserve">–  </w:t>
-            </w:r>
-            <w:r>
-              <w:rPr>
-                <w:color w:val="828482"/>
-                <w:sz w:val="17"/>
-                <w:szCs w:val="17"/>
-              </w:rPr>
-              <w:t>Školení práce s obsahem v CMS (systém pro správu obsahu)</w:t>
-            </w:r>
-          </w:p>
-          <w:p>
-            <w:pPr>
-              <w:spacing w:after="26"/>
-              <w:ind w:left="170" w:hanging="170"/>
-            </w:pPr>
-            <w:r>
-              <w:rPr>
-                <w:color w:val="4CE500"/>
-                <w:sz w:val="17"/>
-                <w:szCs w:val="17"/>
-              </w:rPr>
-              <w:t xml:space="preserve">–  </w:t>
-            </w:r>
-            <w:r>
-              <w:rPr>
-                <w:color w:val="828482"/>
-                <w:sz w:val="17"/>
-                <w:szCs w:val="17"/>
-              </w:rPr>
-              <w:t>Vč. audio / videozáznamu pro pozdější použití</w:t>
-            </w:r>
-          </w:p>
-        </w:tc>
-        <w:tc>
-          <w:tcPr>
-            <w:tcW w:w="2300" w:type="dxa"/>
-            <w:tcBorders>
-              <w:top w:val="single" w:sz="4" w:space="0" w:color="E4E6E4"/>
-              <w:left w:val="none" w:sz="0" w:space="0" w:color="FFFFFF"/>
-              <w:bottom w:val="single" w:sz="4" w:space="0" w:color="E4E6E4"/>
-              <w:right w:val="none" w:sz="0" w:space="0" w:color="FFFFFF"/>
-            </w:tcBorders>
-            <w:shd w:val="clear" w:color="auto" w:fill="FFFFFF"/>
-            <w:tcMar>
-              <w:top w:w="150" w:type="dxa"/>
-              <w:left w:w="120" w:type="dxa"/>
-              <w:bottom w:w="150" w:type="dxa"/>
-              <w:right w:w="200" w:type="dxa"/>
-            </w:tcMar>
-          </w:tcPr>
-          <w:p>
-            <w:pPr>
-              <w:jc w:val="right"/>
-            </w:pPr>
-            <w:r>
-              <w:rPr>
-                <w:rFonts w:ascii="Inter SemiBold" w:eastAsia="Inter SemiBold" w:hAnsi="Inter SemiBold" w:cs="Inter SemiBold"/>
-                <w:highlight w:val="yellow"/>
-              </w:rPr>
-              <w:t>0 Kč</w:t>
-            </w:r>
-          </w:p>
-        </w:tc>
-      </w:tr>
-      <w:tr>
-        <w:tblPrEx>
-          <w:tblCellMar>
-            <w:top w:w="0" w:type="dxa"/>
-            <w:bottom w:w="0" w:type="dxa"/>
-          </w:tblCellMar>
-        </w:tblPrEx>
-        <w:tc>
-          <w:tcPr>
-            <w:tcW w:w="7300" w:type="dxa"/>
-            <w:tcBorders>
-              <w:top w:val="single" w:sz="4" w:space="0" w:color="E4E6E4"/>
-              <w:left w:val="none" w:sz="0" w:space="0" w:color="FFFFFF"/>
-              <w:bottom w:val="single" w:sz="4" w:space="0" w:color="E4E6E4"/>
-              <w:right w:val="none" w:sz="0" w:space="0" w:color="FFFFFF"/>
-            </w:tcBorders>
-            <w:shd w:val="clear" w:color="auto" w:fill="F8FAF8"/>
-            <w:tcMar>
-              <w:top w:w="150" w:type="dxa"/>
-              <w:left w:w="200" w:type="dxa"/>
-              <w:bottom w:w="150" w:type="dxa"/>
-              <w:right w:w="160" w:type="dxa"/>
-            </w:tcMar>
-          </w:tcPr>
-          <w:p>
-            <w:pPr>
-              <w:spacing w:after="80"/>
-            </w:pPr>
-            <w:r>
-              <w:rPr>
-                <w:rFonts w:ascii="Inter SemiBold" w:eastAsia="Inter SemiBold" w:hAnsi="Inter SemiBold" w:cs="Inter SemiBold"/>
-              </w:rPr>
-              <w:t>Jazykové mutace</w:t>
-            </w:r>
-          </w:p>
-          <w:p>
-            <w:pPr>
-              <w:spacing w:after="26"/>
-              <w:ind w:left="170" w:hanging="170"/>
-            </w:pPr>
-            <w:r>
-              <w:rPr>
-                <w:color w:val="4CE500"/>
-                <w:sz w:val="17"/>
-                <w:szCs w:val="17"/>
-              </w:rPr>
-              <w:t xml:space="preserve">–  </w:t>
-            </w:r>
-            <w:r>
-              <w:rPr>
-                <w:color w:val="828482"/>
-                <w:sz w:val="17"/>
-                <w:szCs w:val="17"/>
-              </w:rPr>
-              <w:t>Nyní počítáme s [X] jazykovou mutací ([JAZYK]), 1:1</w:t>
-            </w:r>
-          </w:p>
-          <w:p>
-            <w:pPr>
-              <w:spacing w:after="26"/>
-              <w:ind w:left="170" w:hanging="170"/>
-            </w:pPr>
-            <w:r>
-              <w:rPr>
-                <w:color w:val="4CE500"/>
-                <w:sz w:val="17"/>
-                <w:szCs w:val="17"/>
-              </w:rPr>
-              <w:t xml:space="preserve">–  </w:t>
-            </w:r>
-            <w:r>
-              <w:rPr>
-                <w:color w:val="828482"/>
-                <w:sz w:val="17"/>
-                <w:szCs w:val="17"/>
-              </w:rPr>
-              <w:t>Překlady a obsah dodává klient; pokud my, jedná se o samostatnou položku (viz níže)</w:t>
-            </w:r>
-          </w:p>
-          <w:p>
-            <w:pPr>
-              <w:spacing w:after="26"/>
-              <w:ind w:left="170" w:hanging="170"/>
-            </w:pPr>
-            <w:r>
-              <w:rPr>
-                <w:color w:val="4CE500"/>
-                <w:sz w:val="17"/>
-                <w:szCs w:val="17"/>
-              </w:rPr>
-              <w:t xml:space="preserve">–  </w:t>
-            </w:r>
-            <w:r>
-              <w:rPr>
-                <w:color w:val="828482"/>
-                <w:sz w:val="17"/>
-                <w:szCs w:val="17"/>
-              </w:rPr>
-              <w:t>Plnění obsahu webu: [X]× [Y] web-stran</w:t>
-            </w:r>
-          </w:p>
-        </w:tc>
-        <w:tc>
-          <w:tcPr>
-            <w:tcW w:w="2300" w:type="dxa"/>
-            <w:tcBorders>
-              <w:top w:val="single" w:sz="4" w:space="0" w:color="E4E6E4"/>
-              <w:left w:val="none" w:sz="0" w:space="0" w:color="FFFFFF"/>
-              <w:bottom w:val="single" w:sz="4" w:space="0" w:color="E4E6E4"/>
-              <w:right w:val="none" w:sz="0" w:space="0" w:color="FFFFFF"/>
-            </w:tcBorders>
-            <w:shd w:val="clear" w:color="auto" w:fill="F8FAF8"/>
-            <w:tcMar>
-              <w:top w:w="150" w:type="dxa"/>
-              <w:left w:w="120" w:type="dxa"/>
-              <w:bottom w:w="150" w:type="dxa"/>
-              <w:right w:w="200" w:type="dxa"/>
-            </w:tcMar>
-          </w:tcPr>
-          <w:p>
-            <w:pPr>
-              <w:jc w:val="right"/>
-            </w:pPr>
-            <w:r>
-              <w:rPr>
-                <w:rFonts w:ascii="Inter SemiBold" w:eastAsia="Inter SemiBold" w:hAnsi="Inter SemiBold" w:cs="Inter SemiBold"/>
-                <w:highlight w:val="yellow"/>
-              </w:rPr>
-              <w:t>0 Kč</w:t>
-            </w:r>
-          </w:p>
-        </w:tc>
-      </w:tr>
-      <w:tr>
-        <w:tblPrEx>
-          <w:tblCellMar>
-            <w:top w:w="0" w:type="dxa"/>
-            <w:bottom w:w="0" w:type="dxa"/>
-          </w:tblCellMar>
-        </w:tblPrEx>
-        <w:tc>
-          <w:tcPr>
-            <w:tcW w:w="7300" w:type="dxa"/>
-            <w:tcBorders>
-              <w:top w:val="single" w:sz="4" w:space="0" w:color="E4E6E4"/>
-              <w:left w:val="none" w:sz="0" w:space="0" w:color="FFFFFF"/>
-              <w:bottom w:val="single" w:sz="4" w:space="0" w:color="E4E6E4"/>
-              <w:right w:val="none" w:sz="0" w:space="0" w:color="FFFFFF"/>
-            </w:tcBorders>
-            <w:shd w:val="clear" w:color="auto" w:fill="FFFFFF"/>
-            <w:tcMar>
-              <w:top w:w="150" w:type="dxa"/>
-              <w:left w:w="200" w:type="dxa"/>
-              <w:bottom w:w="150" w:type="dxa"/>
-              <w:right w:w="160" w:type="dxa"/>
-            </w:tcMar>
-          </w:tcPr>
-          <w:p>
-            <w:pPr>
-              <w:spacing w:after="80"/>
-            </w:pPr>
-            <w:r>
-              <w:rPr>
-                <w:rFonts w:ascii="Inter SemiBold" w:eastAsia="Inter SemiBold" w:hAnsi="Inter SemiBold" w:cs="Inter SemiBold"/>
-              </w:rPr>
-              <w:t>Projektové řízení</w:t>
-            </w:r>
-          </w:p>
-          <w:p>
-            <w:pPr>
-              <w:spacing w:after="26"/>
-              <w:ind w:left="170" w:hanging="170"/>
-            </w:pPr>
-            <w:r>
-              <w:rPr>
-                <w:color w:val="4CE500"/>
-                <w:sz w:val="17"/>
-                <w:szCs w:val="17"/>
-              </w:rPr>
-              <w:t xml:space="preserve">–  </w:t>
-            </w:r>
-            <w:r>
-              <w:rPr>
-                <w:color w:val="828482"/>
-                <w:sz w:val="17"/>
-                <w:szCs w:val="17"/>
-              </w:rPr>
-              <w:t>Zadání a kontrola práce specialistů</w:t>
-            </w:r>
-          </w:p>
-          <w:p>
-            <w:pPr>
-              <w:spacing w:after="26"/>
-              <w:ind w:left="170" w:hanging="170"/>
-            </w:pPr>
-            <w:r>
-              <w:rPr>
-                <w:color w:val="4CE500"/>
-                <w:sz w:val="17"/>
-                <w:szCs w:val="17"/>
-              </w:rPr>
-              <w:t xml:space="preserve">–  </w:t>
-            </w:r>
-            <w:r>
-              <w:rPr>
-                <w:color w:val="828482"/>
-                <w:sz w:val="17"/>
-                <w:szCs w:val="17"/>
-              </w:rPr>
-              <w:t>Komunikace jednotlivých etap, úprav a oprav s klientem</w:t>
-            </w:r>
-          </w:p>
-          <w:p>
-            <w:pPr>
-              <w:spacing w:after="26"/>
-              <w:ind w:left="170" w:hanging="170"/>
-            </w:pPr>
-            <w:r>
-              <w:rPr>
-                <w:color w:val="4CE500"/>
-                <w:sz w:val="17"/>
-                <w:szCs w:val="17"/>
-              </w:rPr>
-              <w:t xml:space="preserve">–  </w:t>
-            </w:r>
-            <w:r>
-              <w:rPr>
-                <w:color w:val="828482"/>
-                <w:sz w:val="17"/>
-                <w:szCs w:val="17"/>
-              </w:rPr>
-              <w:t>Osobní / video-call schůzky dle potřeby</w:t>
-            </w:r>
-          </w:p>
-          <w:p>
-            <w:pPr>
-              <w:spacing w:after="26"/>
-              <w:ind w:left="170" w:hanging="170"/>
-            </w:pPr>
-            <w:r>
-              <w:rPr>
-                <w:color w:val="4CE500"/>
-                <w:sz w:val="17"/>
-                <w:szCs w:val="17"/>
-              </w:rPr>
-              <w:t xml:space="preserve">–  </w:t>
-            </w:r>
-            <w:r>
-              <w:rPr>
-                <w:color w:val="828482"/>
-                <w:sz w:val="17"/>
-                <w:szCs w:val="17"/>
-              </w:rPr>
-              <w:t xml:space="preserve">Zkompletování prvků jednotlivých stránek – finální struktura a wireframe webu</w:t>
-            </w:r>
-          </w:p>
-        </w:tc>
-        <w:tc>
-          <w:tcPr>
-            <w:tcW w:w="2300" w:type="dxa"/>
-            <w:tcBorders>
-              <w:top w:val="single" w:sz="4" w:space="0" w:color="E4E6E4"/>
-              <w:left w:val="none" w:sz="0" w:space="0" w:color="FFFFFF"/>
-              <w:bottom w:val="single" w:sz="4" w:space="0" w:color="E4E6E4"/>
-              <w:right w:val="none" w:sz="0" w:space="0" w:color="FFFFFF"/>
-            </w:tcBorders>
-            <w:shd w:val="clear" w:color="auto" w:fill="FFFFFF"/>
-            <w:tcMar>
-              <w:top w:w="150" w:type="dxa"/>
-              <w:left w:w="120" w:type="dxa"/>
-              <w:bottom w:w="150" w:type="dxa"/>
-              <w:right w:w="200" w:type="dxa"/>
-            </w:tcMar>
-          </w:tcPr>
-          <w:p>
-            <w:pPr>
-              <w:jc w:val="right"/>
-            </w:pPr>
-            <w:r>
-              <w:rPr>
-                <w:rFonts w:ascii="Inter SemiBold" w:eastAsia="Inter SemiBold" w:hAnsi="Inter SemiBold" w:cs="Inter SemiBold"/>
-                <w:highlight w:val="yellow"/>
-              </w:rPr>
-              <w:t>0 Kč</w:t>
-            </w:r>
-          </w:p>
-        </w:tc>
-      </w:tr>
-      <w:tr>
-        <w:tblPrEx>
-          <w:tblCellMar>
-            <w:top w:w="0" w:type="dxa"/>
-            <w:bottom w:w="0" w:type="dxa"/>
-          </w:tblCellMar>
-        </w:tblPrEx>
-        <w:tc>
-          <w:tcPr>
-            <w:tcW w:w="7300" w:type="dxa"/>
-            <w:tcBorders>
-              <w:top w:val="single" w:sz="4" w:space="0" w:color="E4E6E4"/>
-              <w:left w:val="none" w:sz="0" w:space="0" w:color="FFFFFF"/>
-              <w:bottom w:val="single" w:sz="4" w:space="0" w:color="E4E6E4"/>
-              <w:right w:val="none" w:sz="0" w:space="0" w:color="FFFFFF"/>
-            </w:tcBorders>
-            <w:shd w:val="clear" w:color="auto" w:fill="F8FAF8"/>
-            <w:tcMar>
-              <w:top w:w="150" w:type="dxa"/>
-              <w:left w:w="200" w:type="dxa"/>
-              <w:bottom w:w="150" w:type="dxa"/>
-              <w:right w:w="160" w:type="dxa"/>
-            </w:tcMar>
-          </w:tcPr>
-          <w:p>
-            <w:pPr>
-              <w:spacing w:after="80"/>
-            </w:pPr>
-            <w:r>
-              <w:rPr>
-                <w:rFonts w:ascii="Inter SemiBold" w:eastAsia="Inter SemiBold" w:hAnsi="Inter SemiBold" w:cs="Inter SemiBold"/>
-              </w:rPr>
-              <w:t>Testování a spuštění webu</w:t>
-            </w:r>
-          </w:p>
-          <w:p>
-            <w:pPr>
-              <w:spacing w:after="26"/>
-              <w:ind w:left="170" w:hanging="170"/>
-            </w:pPr>
-            <w:r>
-              <w:rPr>
-                <w:color w:val="4CE500"/>
-                <w:sz w:val="17"/>
-                <w:szCs w:val="17"/>
-              </w:rPr>
-              <w:lastRenderedPageBreak/>
-              <w:t xml:space="preserve">–  </w:t>
-            </w:r>
-            <w:r>
-              <w:rPr>
-                <w:color w:val="828482"/>
-                <w:sz w:val="17"/>
-                <w:szCs w:val="17"/>
-              </w:rPr>
-              <w:t xml:space="preserve">Implementace Google Analytics 4</w:t>
-            </w:r>
-          </w:p>
-          <w:p>
-            <w:pPr>
-              <w:spacing w:after="26"/>
-              <w:ind w:left="170" w:hanging="170"/>
-            </w:pPr>
-            <w:r>
-              <w:rPr>
-                <w:color w:val="4CE500"/>
-                <w:sz w:val="17"/>
-                <w:szCs w:val="17"/>
-              </w:rPr>
-              <w:t xml:space="preserve">–  </w:t>
-            </w:r>
-            <w:r>
-              <w:rPr>
-                <w:color w:val="828482"/>
-                <w:sz w:val="17"/>
-                <w:szCs w:val="17"/>
-              </w:rPr>
-              <w:t>Integrace GTM a nastavení měření cílů</w:t>
-            </w:r>
-          </w:p>
-          <w:p>
-            <w:pPr>
-              <w:spacing w:after="26"/>
-              <w:ind w:left="170" w:hanging="170"/>
-            </w:pPr>
-            <w:r>
-              <w:rPr>
-                <w:color w:val="4CE500"/>
-                <w:sz w:val="17"/>
-                <w:szCs w:val="17"/>
-              </w:rPr>
-              <w:t xml:space="preserve">–  </w:t>
-            </w:r>
-            <w:r>
-              <w:rPr>
-                <w:color w:val="828482"/>
-                <w:sz w:val="17"/>
-                <w:szCs w:val="17"/>
-              </w:rPr>
-              <w:t>Vložení lišty pro souhlas s používáním cookies</w:t>
-            </w:r>
-          </w:p>
-          <w:p>
-            <w:pPr>
-              <w:spacing w:after="26"/>
-              <w:ind w:left="170" w:hanging="170"/>
-            </w:pPr>
-            <w:r>
-              <w:rPr>
-                <w:color w:val="4CE500"/>
-                <w:sz w:val="17"/>
-                <w:szCs w:val="17"/>
-              </w:rPr>
-              <w:t xml:space="preserve">–  </w:t>
-            </w:r>
-            <w:r>
-              <w:rPr>
-                <w:color w:val="828482"/>
-                <w:sz w:val="17"/>
-                <w:szCs w:val="17"/>
-              </w:rPr>
-              <w:t>Přesměrování stávajících URL adres ([X] nejnavštěvovanějších dle GA, zbytek na hlavní stranu)</w:t>
-            </w:r>
-          </w:p>
-          <w:p>
-            <w:pPr>
-              <w:spacing w:after="26"/>
-              <w:ind w:left="170" w:hanging="170"/>
-            </w:pPr>
-            <w:r>
-              <w:rPr>
-                <w:color w:val="4CE500"/>
-                <w:sz w:val="17"/>
-                <w:szCs w:val="17"/>
-              </w:rPr>
-              <w:t xml:space="preserve">–  </w:t>
-            </w:r>
-            <w:r>
-              <w:rPr>
-                <w:color w:val="828482"/>
-                <w:sz w:val="17"/>
-                <w:szCs w:val="17"/>
-              </w:rPr>
-              <w:t>Spuštění prezentace na serveru</w:t>
-            </w:r>
-          </w:p>
-          <w:p>
-            <w:pPr>
-              <w:spacing w:after="26"/>
-              <w:ind w:left="170" w:hanging="170"/>
-            </w:pPr>
-            <w:r>
-              <w:rPr>
-                <w:color w:val="4CE500"/>
-                <w:sz w:val="17"/>
-                <w:szCs w:val="17"/>
-              </w:rPr>
-              <w:t xml:space="preserve">–  </w:t>
-            </w:r>
-            <w:r>
-              <w:rPr>
-                <w:color w:val="828482"/>
-                <w:sz w:val="17"/>
-                <w:szCs w:val="17"/>
-              </w:rPr>
-              <w:t>Nastavení DNS záznamů domény</w:t>
-            </w:r>
-          </w:p>
-          <w:p>
-            <w:pPr>
-              <w:spacing w:after="26"/>
-              <w:ind w:left="170" w:hanging="170"/>
-            </w:pPr>
-            <w:r>
-              <w:rPr>
-                <w:color w:val="4CE500"/>
-                <w:sz w:val="17"/>
-                <w:szCs w:val="17"/>
-              </w:rPr>
-              <w:t xml:space="preserve">–  </w:t>
-            </w:r>
-            <w:r>
-              <w:rPr>
-                <w:color w:val="828482"/>
-                <w:sz w:val="17"/>
-                <w:szCs w:val="17"/>
-              </w:rPr>
-              <w:t>Testování v produkčním prostředí</w:t>
-            </w:r>
-          </w:p>
-        </w:tc>
-        <w:tc>
-          <w:tcPr>
-            <w:tcW w:w="2300" w:type="dxa"/>
-            <w:tcBorders>
-              <w:top w:val="single" w:sz="4" w:space="0" w:color="E4E6E4"/>
-              <w:left w:val="none" w:sz="0" w:space="0" w:color="FFFFFF"/>
-              <w:bottom w:val="single" w:sz="4" w:space="0" w:color="E4E6E4"/>
-              <w:right w:val="none" w:sz="0" w:space="0" w:color="FFFFFF"/>
-            </w:tcBorders>
-            <w:shd w:val="clear" w:color="auto" w:fill="F8FAF8"/>
-            <w:tcMar>
-              <w:top w:w="150" w:type="dxa"/>
-              <w:left w:w="120" w:type="dxa"/>
-              <w:bottom w:w="150" w:type="dxa"/>
-              <w:right w:w="200" w:type="dxa"/>
-            </w:tcMar>
-          </w:tcPr>
-          <w:p>
-            <w:pPr>
-              <w:jc w:val="right"/>
-            </w:pPr>
-            <w:r>
-              <w:rPr>
-                <w:rFonts w:ascii="Inter SemiBold" w:eastAsia="Inter SemiBold" w:hAnsi="Inter SemiBold" w:cs="Inter SemiBold"/>
-                <w:highlight w:val="yellow"/>
-              </w:rPr>
-              <w:lastRenderedPageBreak/>
-              <w:t>0 Kč</w:t>
-            </w:r>
-          </w:p>
-        </w:tc>
-      </w:tr>
-      <w:tr>
-        <w:tblPrEx>
-          <w:tblCellMar>
-            <w:top w:w="0" w:type="dxa"/>
-            <w:bottom w:w="0" w:type="dxa"/>
-          </w:tblCellMar>
-        </w:tblPrEx>
         <w:tc>
           <w:tcPr>
             <w:tcW w:w="0" w:type="auto"/>
@@ -2198,12 +987,16 @@
       <w:pPr>
         <w:keepNext/>
         <w:spacing w:before="220" w:after="90"/>
+        <w:rPr>
+          <w:sz w:val="20"/>
+          <w:szCs w:val="20"/>
+        </w:rPr>
       </w:pPr>
       <w:r>
         <w:rPr>
           <w:rFonts w:ascii="Space Grotesk SemiBold" w:eastAsia="Space Grotesk SemiBold" w:hAnsi="Space Grotesk SemiBold" w:cs="Space Grotesk SemiBold"/>
-          <w:sz w:val="23"/>
-          <w:szCs w:val="23"/>
+          <w:sz w:val="20"/>
+          <w:szCs w:val="20"/>
         </w:rPr>
         <w:t>Poznámky</w:t>
       </w:r>
@@ -2216,8 +1009,20 @@
           <w:numId w:val="2"/>
         </w:numPr>
         <w:spacing w:after="70" w:line="268" w:lineRule="auto"/>
-      </w:pPr>
-      <w:r>
+        <w:rPr>
+          <w:i/>
+          <w:iCs/>
+          <w:sz w:val="20"/>
+          <w:szCs w:val="20"/>
+        </w:rPr>
+      </w:pPr>
+      <w:r>
+        <w:rPr>
+          <w:i/>
+          <w:iCs/>
+          <w:sz w:val="20"/>
+          <w:szCs w:val="20"/>
+        </w:rPr>
         <w:t>Nabídka počítá s dodáním obsahu klientem (kromě započítaných prací „copywriting“).</w:t>
       </w:r>
     </w:p>
@@ -2229,17 +1034,39 @@
           <w:numId w:val="2"/>
         </w:numPr>
         <w:spacing w:after="70" w:line="268" w:lineRule="auto"/>
-      </w:pPr>
-      <w:r>
+        <w:rPr>
+          <w:i/>
+          <w:iCs/>
+          <w:sz w:val="20"/>
+          <w:szCs w:val="20"/>
+        </w:rPr>
+      </w:pPr>
+      <w:r>
+        <w:rPr>
+          <w:i/>
+          <w:iCs/>
+          <w:sz w:val="20"/>
+          <w:szCs w:val="20"/>
+        </w:rPr>
         <w:t xml:space="preserve">Všechny ceny jsou uvedeny </w:t>
       </w:r>
       <w:r>
         <w:rPr>
           <w:rFonts w:ascii="Inter SemiBold" w:eastAsia="Inter SemiBold" w:hAnsi="Inter SemiBold" w:cs="Inter SemiBold"/>
+          <w:i/>
+          <w:iCs/>
+          <w:sz w:val="20"/>
+          <w:szCs w:val="20"/>
         </w:rPr>
         <w:t>bez DPH</w:t>
       </w:r>
       <w:r>
+        <w:rPr>
+          <w:i/>
+          <w:iCs/>
+          <w:sz w:val="20"/>
+          <w:szCs w:val="20"/>
+        </w:rPr>
         <w:t>. Nabídka je platná 2 měsíce od jejího zaslání.</w:t>
       </w:r>
     </w:p>
@@ -2250,18 +1077,9 @@
     </w:p>
     <w:p>
       <w:pPr>
-        <w:keepNext/>
-        <w:pBdr>
-          <w:bottom w:val="single" w:sz="14" w:space="6" w:color="4CE500"/>
-        </w:pBdr>
-        <w:spacing w:before="340" w:after="140"/>
-      </w:pPr>
-      <w:r>
-        <w:rPr>
-          <w:rFonts w:ascii="Space Grotesk SemiBold" w:eastAsia="Space Grotesk SemiBold" w:hAnsi="Space Grotesk SemiBold" w:cs="Space Grotesk SemiBold"/>
-          <w:sz w:val="30"/>
-          <w:szCs w:val="30"/>
-        </w:rPr>
+        <w:pStyle w:val="AITOMNadpisSekce"/>
+      </w:pPr>
+      <w:r>
         <w:t>Harmonogram tvorby webu</w:t>
       </w:r>
     </w:p>
@@ -2270,9 +1088,202 @@
         <w:spacing w:after="120" w:line="276" w:lineRule="auto"/>
       </w:pPr>
       <w:r>
-        <w:t xml:space="preserve">Detailní harmonogram bude určen při podpisu objednávky tvorby webu. Nyní počítáme s </w:t>
+        <w:t xml:space="preserve">Detailní harmonogram bude určen při podpisu objednávky tvorby webu. Nyní orientačně počítáme s tímto rozvržením prací (ukázkové položky, doplň dle reálného rozsahu):</w:t>
       </w:r>
     </w:p>
+    <w:tbl>
+      <w:tblPr>
+        <w:tblStyle w:val="AITOMTabulkaHarmonogram"/>
+        <w:tblW w:w="9600" w:type="dxa"/>
+        <w:tblLook w:val="04A0" w:firstRow="1" w:lastRow="0" w:firstColumn="1" w:lastColumn="0" w:noHBand="0" w:noVBand="1"/>
+      </w:tblPr>
+      <w:tblGrid>
+        <w:gridCol w:w="6600"/>
+        <w:gridCol w:w="3000"/>
+      </w:tblGrid>
+      <w:tr>
+        <w:tc>
+          <w:tcPr>
+            <w:tcW w:w="0" w:type="auto"/>
+            <w:shd w:val="clear" w:color="auto" w:fill="0B0D0B"/>
+          </w:tcPr>
+          <w:p>
+            <w:pPr>
+              <w:pStyle w:val="AITOMLabelTmavy"/>
+            </w:pPr>
+            <w:r>
+              <w:rPr>
+                <w:rStyle w:val="AITOMLabelTmavy"/>
+              </w:rPr>
+              <w:t>PRÁCE</w:t>
+            </w:r>
+          </w:p>
+        </w:tc>
+        <w:tc>
+          <w:tcPr>
+            <w:tcW w:w="0" w:type="auto"/>
+            <w:shd w:val="clear" w:color="auto" w:fill="0B0D0B"/>
+          </w:tcPr>
+          <w:p>
+            <w:pPr>
+              <w:pStyle w:val="AITOMLabelTmavy"/>
+              <w:jc w:val="right"/>
+            </w:pPr>
+            <w:r>
+              <w:rPr>
+                <w:rStyle w:val="AITOMLabelTmavy"/>
+              </w:rPr>
+              <w:t>DOBA TRVÁNÍ</w:t>
+            </w:r>
+          </w:p>
+        </w:tc>
+      </w:tr>
+      <w:tr>
+        <w:tc>
+          <w:tcPr>
+            <w:tcW w:w="0" w:type="auto"/>
+          </w:tcPr>
+          <w:p>
+            <w:pPr>
+              <w:pStyle w:val="AITOMHarmonogramPrace"/>
+            </w:pPr>
+            <w:r>
+              <w:t>Práce 1</w:t>
+            </w:r>
+          </w:p>
+        </w:tc>
+        <w:tc>
+          <w:tcPr>
+            <w:tcW w:w="0" w:type="auto"/>
+          </w:tcPr>
+          <w:p>
+            <w:pPr>
+              <w:pStyle w:val="AITOMHarmonogramDoba"/>
+              <w:jc w:val="right"/>
+            </w:pPr>
+            <w:r>
+              <w:t>1 týden</w:t>
+            </w:r>
+          </w:p>
+        </w:tc>
+      </w:tr>
+      <w:tr>
+        <w:tc>
+          <w:tcPr>
+            <w:tcW w:w="0" w:type="auto"/>
+          </w:tcPr>
+          <w:p>
+            <w:pPr>
+              <w:pStyle w:val="AITOMHarmonogramPrace"/>
+            </w:pPr>
+            <w:r>
+              <w:t>Práce 2</w:t>
+            </w:r>
+          </w:p>
+        </w:tc>
+        <w:tc>
+          <w:tcPr>
+            <w:tcW w:w="0" w:type="auto"/>
+          </w:tcPr>
+          <w:p>
+            <w:pPr>
+              <w:pStyle w:val="AITOMHarmonogramDoba"/>
+              <w:jc w:val="right"/>
+            </w:pPr>
+            <w:r>
+              <w:t>1–2 týdny</w:t>
+            </w:r>
+          </w:p>
+        </w:tc>
+      </w:tr>
+      <w:tr>
+        <w:tc>
+          <w:tcPr>
+            <w:tcW w:w="0" w:type="auto"/>
+          </w:tcPr>
+          <w:p>
+            <w:pPr>
+              <w:pStyle w:val="AITOMHarmonogramPrace"/>
+            </w:pPr>
+            <w:r>
+              <w:t>Práce 3</w:t>
+            </w:r>
+          </w:p>
+        </w:tc>
+        <w:tc>
+          <w:tcPr>
+            <w:tcW w:w="0" w:type="auto"/>
+          </w:tcPr>
+          <w:p>
+            <w:pPr>
+              <w:pStyle w:val="AITOMHarmonogramDoba"/>
+              <w:jc w:val="right"/>
+            </w:pPr>
+            <w:r>
+              <w:t>2 týdny</w:t>
+            </w:r>
+          </w:p>
+        </w:tc>
+      </w:tr>
+      <w:tr>
+        <w:tc>
+          <w:tcPr>
+            <w:tcW w:w="0" w:type="auto"/>
+          </w:tcPr>
+          <w:p>
+            <w:pPr>
+              <w:pStyle w:val="AITOMHarmonogramPrace"/>
+            </w:pPr>
+            <w:r>
+              <w:t>Práce 4</w:t>
+            </w:r>
+          </w:p>
+        </w:tc>
+        <w:tc>
+          <w:tcPr>
+            <w:tcW w:w="0" w:type="auto"/>
+          </w:tcPr>
+          <w:p>
+            <w:pPr>
+              <w:pStyle w:val="AITOMHarmonogramDoba"/>
+              <w:jc w:val="right"/>
+            </w:pPr>
+            <w:r>
+              <w:t>1 týden</w:t>
+            </w:r>
+          </w:p>
+        </w:tc>
+      </w:tr>
+      <w:tr>
+        <w:tc>
+          <w:tcPr>
+            <w:tcW w:w="0" w:type="auto"/>
+          </w:tcPr>
+          <w:p>
+            <w:pPr>
+              <w:pStyle w:val="AITOMHarmonogramPrace"/>
+            </w:pPr>
+            <w:r>
+              <w:t>Práce 5</w:t>
+            </w:r>
+          </w:p>
+        </w:tc>
+        <w:tc>
+          <w:tcPr>
+            <w:tcW w:w="0" w:type="auto"/>
+          </w:tcPr>
+          <w:p>
+            <w:pPr>
+              <w:pStyle w:val="AITOMHarmonogramDoba"/>
+              <w:jc w:val="right"/>
+            </w:pPr>
+            <w:r>
+              <w:t>1–2 týdny</w:t>
+            </w:r>
+          </w:p>
+        </w:tc>
+      </w:tr>
+    </w:tbl>
     <w:p>
       <w:pPr>
         <w:pBdr>
@@ -2287,7 +1298,7 @@
       </w:pPr>
       <w:r>
         <w:rPr>
-          <w:rFonts w:ascii="Inter Medium" w:eastAsia="Inter Medium" w:hAnsi="Inter Medium" w:cs="Inter Medium"/>
+          <w:rStyle w:val="AITOMOdkaz"/>
         </w:rPr>
         <w:t>Obecné podmínky spolupráce při tvorbě webu jsou uvedeny v Příloze č. 1.</w:t>
       </w:r>
@@ -2391,6 +1402,119 @@
     </w:lvl>
   </w:abstractNum>
   <w:abstractNum w:abstractNumId="1" w15:restartNumberingAfterBreak="0">
+    <w:nsid w:val="3FD646A7"/>
+    <w:multiLevelType w:val="hybridMultilevel"/>
+    <w:tmpl w:val="788064A2"/>
+    <w:lvl w:ilvl="0" w:tplc="04050001">
+      <w:start w:val="1"/>
+      <w:numFmt w:val="bullet"/>
+      <w:lvlText w:val=""/>
+      <w:lvlJc w:val="left"/>
+      <w:pPr>
+        <w:ind w:left="720" w:hanging="360"/>
+      </w:pPr>
+      <w:rPr>
+        <w:rFonts w:ascii="Symbol" w:hAnsi="Symbol" w:hint="default"/>
+      </w:rPr>
+    </w:lvl>
+    <w:lvl w:ilvl="1" w:tplc="04050003" w:tentative="1">
+      <w:start w:val="1"/>
+      <w:numFmt w:val="bullet"/>
+      <w:lvlText w:val="o"/>
+      <w:lvlJc w:val="left"/>
+      <w:pPr>
+        <w:ind w:left="1440" w:hanging="360"/>
+      </w:pPr>
+      <w:rPr>
+        <w:rFonts w:ascii="Courier New" w:hAnsi="Courier New" w:cs="Courier New" w:hint="default"/>
+      </w:rPr>
+    </w:lvl>
+    <w:lvl w:ilvl="2" w:tplc="04050005" w:tentative="1">
+      <w:start w:val="1"/>
+      <w:numFmt w:val="bullet"/>
+      <w:lvlText w:val=""/>
+      <w:lvlJc w:val="left"/>
+      <w:pPr>
+        <w:ind w:left="2160" w:hanging="360"/>
+      </w:pPr>
+      <w:rPr>
+        <w:rFonts w:ascii="Wingdings" w:hAnsi="Wingdings" w:hint="default"/>
+      </w:rPr>
+    </w:lvl>
+    <w:lvl w:ilvl="3" w:tplc="04050001" w:tentative="1">
+      <w:start w:val="1"/>
+      <w:numFmt w:val="bullet"/>
+      <w:lvlText w:val=""/>
+      <w:lvlJc w:val="left"/>
+      <w:pPr>
+        <w:ind w:left="2880" w:hanging="360"/>
+      </w:pPr>
+      <w:rPr>
+        <w:rFonts w:ascii="Symbol" w:hAnsi="Symbol" w:hint="default"/>
+      </w:rPr>
+    </w:lvl>
+    <w:lvl w:ilvl="4" w:tplc="04050003" w:tentative="1">
+      <w:start w:val="1"/>
+      <w:numFmt w:val="bullet"/>
+      <w:lvlText w:val="o"/>
+      <w:lvlJc w:val="left"/>
+      <w:pPr>
+        <w:ind w:left="3600" w:hanging="360"/>
+      </w:pPr>
+      <w:rPr>
+        <w:rFonts w:ascii="Courier New" w:hAnsi="Courier New" w:cs="Courier New" w:hint="default"/>
+      </w:rPr>
+    </w:lvl>
+    <w:lvl w:ilvl="5" w:tplc="04050005" w:tentative="1">
+      <w:start w:val="1"/>
+      <w:numFmt w:val="bullet"/>
+      <w:lvlText w:val=""/>
+      <w:lvlJc w:val="left"/>
+      <w:pPr>
+        <w:ind w:left="4320" w:hanging="360"/>
+      </w:pPr>
+      <w:rPr>
+        <w:rFonts w:ascii="Wingdings" w:hAnsi="Wingdings" w:hint="default"/>
+      </w:rPr>
+    </w:lvl>
+    <w:lvl w:ilvl="6" w:tplc="04050001" w:tentative="1">
+      <w:start w:val="1"/>
+      <w:numFmt w:val="bullet"/>
+      <w:lvlText w:val=""/>
+      <w:lvlJc w:val="left"/>
+      <w:pPr>
+        <w:ind w:left="5040" w:hanging="360"/>
+      </w:pPr>
+      <w:rPr>
+        <w:rFonts w:ascii="Symbol" w:hAnsi="Symbol" w:hint="default"/>
+      </w:rPr>
+    </w:lvl>
+    <w:lvl w:ilvl="7" w:tplc="04050003" w:tentative="1">
+      <w:start w:val="1"/>
+      <w:numFmt w:val="bullet"/>
+      <w:lvlText w:val="o"/>
+      <w:lvlJc w:val="left"/>
+      <w:pPr>
+        <w:ind w:left="5760" w:hanging="360"/>
+      </w:pPr>
+      <w:rPr>
+        <w:rFonts w:ascii="Courier New" w:hAnsi="Courier New" w:cs="Courier New" w:hint="default"/>
+      </w:rPr>
+    </w:lvl>
+    <w:lvl w:ilvl="8" w:tplc="04050005" w:tentative="1">
+      <w:start w:val="1"/>
+      <w:numFmt w:val="bullet"/>
+      <w:lvlText w:val=""/>
+      <w:lvlJc w:val="left"/>
+      <w:pPr>
+        <w:ind w:left="6480" w:hanging="360"/>
+      </w:pPr>
+      <w:rPr>
+        <w:rFonts w:ascii="Wingdings" w:hAnsi="Wingdings" w:hint="default"/>
+      </w:rPr>
+    </w:lvl>
+  </w:abstractNum>
+  <w:abstractNum w:abstractNumId="2" w15:restartNumberingAfterBreak="0">
     <w:nsid w:val="6F8F0FF5"/>
     <w:multiLevelType w:val="hybridMultilevel"/>
     <w:tmpl w:val="99B2D1C8"/>
@@ -2463,10 +1587,13 @@
     </w:lvlOverride>
   </w:num>
   <w:num w:numId="2" w16cid:durableId="1849522631">
-    <w:abstractNumId w:val="1"/>
+    <w:abstractNumId w:val="2"/>
     <w:lvlOverride w:ilvl="0">
       <w:startOverride w:val="1"/>
     </w:lvlOverride>
+  </w:num>
+  <w:num w:numId="3" w16cid:durableId="1589581583">
+    <w:abstractNumId w:val="1"/>
   </w:num>
 </w:numbering>
 </file>
@@ -3070,6 +2197,196 @@
       <w:szCs w:val="20"/>
     </w:rPr>
   </w:style>
+  <w:style w:type="paragraph" w:customStyle="1" w:styleId="AITOMNadpisSekce">
+    <w:name w:val="AITOM - Nadpis sekce"/>
+    <w:basedOn w:val="Normln"/>
+    <w:qFormat/>
+    <w:pPr>
+      <w:keepNext/>
+      <w:pBdr>
+        <w:bottom w:val="single" w:sz="14" w:space="6" w:color="4CE500"/>
+      </w:pBdr>
+      <w:spacing w:before="340" w:after="140"/>
+    </w:pPr>
+    <w:rPr>
+      <w:rFonts w:ascii="Space Grotesk SemiBold" w:eastAsia="Space Grotesk SemiBold" w:hAnsi="Space Grotesk SemiBold" w:cs="Space Grotesk SemiBold"/>
+      <w:sz w:val="30"/>
+      <w:szCs w:val="30"/>
+    </w:rPr>
+  </w:style>
+  <w:style w:type="paragraph" w:customStyle="1" w:styleId="AITOMNadpisPriloha">
+    <w:name w:val="AITOM - Nadpis přílohy"/>
+    <w:basedOn w:val="Normln"/>
+    <w:qFormat/>
+    <w:pPr>
+      <w:pBdr>
+        <w:bottom w:val="single" w:sz="14" w:space="6" w:color="4CE500"/>
+      </w:pBdr>
+      <w:spacing w:after="60"/>
+    </w:pPr>
+    <w:rPr>
+      <w:rFonts w:ascii="Space Grotesk" w:eastAsia="Space Grotesk" w:hAnsi="Space Grotesk" w:cs="Space Grotesk"/>
+      <w:b/>
+      <w:bCs/>
+      <w:sz w:val="40"/>
+      <w:szCs w:val="40"/>
+    </w:rPr>
+  </w:style>
+  <w:style w:type="paragraph" w:customStyle="1" w:styleId="AITOMNadpisPodsekce">
+    <w:name w:val="AITOM - Nadpis podsekce"/>
+    <w:basedOn w:val="Normln"/>
+    <w:qFormat/>
+    <w:pPr>
+      <w:keepNext/>
+      <w:spacing w:before="220" w:after="90"/>
+    </w:pPr>
+    <w:rPr>
+      <w:rFonts w:ascii="Space Grotesk SemiBold" w:eastAsia="Space Grotesk SemiBold" w:hAnsi="Space Grotesk SemiBold" w:cs="Space Grotesk SemiBold"/>
+      <w:sz w:val="23"/>
+      <w:szCs w:val="23"/>
+    </w:rPr>
+  </w:style>
+  <w:style w:type="paragraph" w:customStyle="1" w:styleId="AITOMLabelSvetly">
+    <w:name w:val="AITOM - Label světlé pozadí"/>
+    <w:basedOn w:val="Normln"/>
+    <w:qFormat/>
+    <w:rPr>
+      <w:rFonts w:ascii="Space Grotesk SemiBold" w:eastAsia="Space Grotesk SemiBold" w:hAnsi="Space Grotesk SemiBold" w:cs="Space Grotesk SemiBold"/>
+      <w:color w:val="828482"/>
+      <w:spacing w:val="40"/>
+      <w:sz w:val="15"/>
+      <w:szCs w:val="15"/>
+    </w:rPr>
+  </w:style>
+  <w:style w:type="paragraph" w:customStyle="1" w:styleId="AITOMLabelTmavy">
+    <w:name w:val="AITOM - Label tmavé pozadí"/>
+    <w:basedOn w:val="Normln"/>
+    <w:qFormat/>
+    <w:rPr>
+      <w:rFonts w:ascii="Space Grotesk SemiBold" w:eastAsia="Space Grotesk SemiBold" w:hAnsi="Space Grotesk SemiBold" w:cs="Space Grotesk SemiBold"/>
+      <w:color w:val="FFFFFF"/>
+      <w:spacing w:val="20"/>
+      <w:sz w:val="19"/>
+      <w:szCs w:val="19"/>
+    </w:rPr>
+  </w:style>
+  <w:style w:type="paragraph" w:customStyle="1" w:styleId="AITOMAdresa">
+    <w:name w:val="AITOM - Adresní řádek"/>
+    <w:basedOn w:val="Normln"/>
+    <w:qFormat/>
+    <w:rPr>
+      <w:color w:val="828482"/>
+      <w:sz w:val="19"/>
+      <w:szCs w:val="19"/>
+    </w:rPr>
+  </w:style>
+  <w:style w:type="paragraph" w:customStyle="1" w:styleId="AITOMOdrazkaPolozky">
+    <w:name w:val="AITOM - Odrážka položky"/>
+    <w:basedOn w:val="Normln"/>
+    <w:qFormat/>
+    <w:pPr>
+      <w:spacing w:after="26"/>
+      <w:ind w:left="170" w:hanging="170"/>
+    </w:pPr>
+  </w:style>
+  <w:style w:type="character" w:customStyle="1" w:styleId="AITOMDuraz">
+    <w:name w:val="AITOM - Důraz SemiBold"/>
+    <w:basedOn w:val="Standardnpsmoodstavce"/>
+    <w:qFormat/>
+    <w:rPr>
+      <w:rFonts w:ascii="Inter SemiBold" w:eastAsia="Inter SemiBold" w:hAnsi="Inter SemiBold" w:cs="Inter SemiBold"/>
+    </w:rPr>
+  </w:style>
+  <w:style w:type="character" w:customStyle="1" w:styleId="AITOMCastkaZvyraznena">
+    <w:name w:val="AITOM - Částka zvýrazněná"/>
+    <w:basedOn w:val="AITOMDuraz"/>
+    <w:qFormat/>
+    <w:rPr>
+      <w:rFonts w:ascii="Inter SemiBold" w:eastAsia="Inter SemiBold" w:hAnsi="Inter SemiBold" w:cs="Inter SemiBold"/>
+      <w:highlight w:val="yellow"/>
+    </w:rPr>
+  </w:style>
+  <w:style w:type="character" w:customStyle="1" w:styleId="AITOMOdrazkaZnacka">
+    <w:name w:val="AITOM - Odrážka značka"/>
+    <w:basedOn w:val="Standardnpsmoodstavce"/>
+    <w:qFormat/>
+    <w:rPr>
+      <w:color w:val="4CE500"/>
+      <w:sz w:val="17"/>
+      <w:szCs w:val="17"/>
+    </w:rPr>
+  </w:style>
+  <w:style w:type="character" w:customStyle="1" w:styleId="AITOMOdrazkaText">
+    <w:name w:val="AITOM - Odrážka text"/>
+    <w:basedOn w:val="Standardnpsmoodstavce"/>
+    <w:qFormat/>
+    <w:rPr>
+      <w:color w:val="828482"/>
+      <w:sz w:val="17"/>
+      <w:szCs w:val="17"/>
+    </w:rPr>
+  </w:style>
+  <w:style w:type="character" w:customStyle="1" w:styleId="AITOMOdkaz">
+    <w:name w:val="AITOM - Odkaz (medium)"/>
+    <w:basedOn w:val="Standardnpsmoodstavce"/>
+    <w:qFormat/>
+    <w:rPr>
+      <w:rFonts w:ascii="Inter Medium" w:eastAsia="Inter Medium" w:hAnsi="Inter Medium" w:cs="Inter Medium"/>
+    </w:rPr>
+  </w:style>
+  <w:style w:type="paragraph" w:customStyle="1" w:styleId="AITOMOdrazkaSeznam">
+    <w:name w:val="AITOM - Odrážka (seznam v tabulce)"/>
+    <w:basedOn w:val="Odstavecseseznamem"/>
+    <w:qFormat/>
+    <w:pPr>
+      <w:numPr>
+        <w:ilvl w:val="0"/>
+        <w:numId w:val="2"/>
+      </w:numPr>
+      <w:spacing w:after="26"/>
+    </w:pPr>
+    <w:rPr>
+      <w:color w:val="828482"/>
+      <w:sz w:val="17"/>
+      <w:szCs w:val="17"/>
+    </w:rPr>
+  </w:style>
+  <w:style w:type="table" w:customStyle="1" w:styleId="AITOMTabulkaHarmonogram">
+    <w:name w:val="AITOM - Tabulka harmonogram"/>
+    <w:basedOn w:val="Normlntabulka"/>
+    <w:qFormat/>
+    <w:tblPr>
+      <w:tblBorders>
+        <w:top w:val="single" w:sz="4" w:space="0" w:color="E4E6E4"/>
+        <w:bottom w:val="single" w:sz="4" w:space="0" w:color="E4E6E4"/>
+        <w:insideH w:val="single" w:sz="4" w:space="0" w:color="E4E6E4"/>
+      </w:tblBorders>
+    </w:tblPr>
+    <w:tcPr>
+      <w:tcMar>
+        <w:top w:w="120" w:type="dxa"/>
+        <w:left w:w="200" w:type="dxa"/>
+        <w:bottom w:w="120" w:type="dxa"/>
+        <w:right w:w="200" w:type="dxa"/>
+      </w:tcMar>
+    </w:tcPr>
+  </w:style>
+  <w:style w:type="paragraph" w:customStyle="1" w:styleId="AITOMHarmonogramPrace">
+    <w:name w:val="AITOM - Harmonogram práce"/>
+    <w:basedOn w:val="Normln"/>
+    <w:qFormat/>
+    <w:rPr>
+      <w:rFonts w:ascii="Inter SemiBold" w:eastAsia="Inter SemiBold" w:hAnsi="Inter SemiBold" w:cs="Inter SemiBold"/>
+    </w:rPr>
+  </w:style>
+  <w:style w:type="paragraph" w:customStyle="1" w:styleId="AITOMHarmonogramDoba">
+    <w:name w:val="AITOM - Harmonogram doba"/>
+    <w:basedOn w:val="Normln"/>
+    <w:qFormat/>
+    <w:rPr>
+      <w:color w:val="828482"/>
+    </w:rPr>
+  </w:style>
 </w:styles>
 </file>
 

</xml_diff>

<commit_message>
Change objednavka heading underlines from green accent to neutral gray
Cyber Green is a single-use accent per brand rules, not a structural
color — using it as a repeated underline under every section heading
violated that. Switched to light-gray (#C9CBC9), the brand token
already defined for subtle borders.

Co-Authored-By: Claude Sonnet 5 <noreply@anthropic.com>
</commit_message>
<xml_diff>
--- a/docs/templates/objednavka/vzor-objednavka.docx
+++ b/docs/templates/objednavka/vzor-objednavka.docx
@@ -197,19 +197,16 @@
               <w:spacing w:after="60"/>
             </w:pPr>
             <w:r>
+              <w:t>ZHOTOVITEL</w:t>
+            </w:r>
+          </w:p>
+          <w:p>
+            <w:pPr>
+              <w:spacing w:after="20" w:line="250" w:lineRule="auto"/>
+            </w:pPr>
+            <w:r>
               <w:rPr>
-                <w:rStyle w:val="AITOMLabelSvetly"/>
-              </w:rPr>
-              <w:t>ZHOTOVITEL</w:t>
-            </w:r>
-          </w:p>
-          <w:p>
-            <w:pPr>
-              <w:spacing w:after="20" w:line="250" w:lineRule="auto"/>
-            </w:pPr>
-            <w:r>
-              <w:rPr>
-                <w:rStyle w:val="AITOMDuraz"/>
+                <w:rStyle w:val="AITOM-DrazSemiBold"/>
               </w:rPr>
               <w:t>AITOM Digital s.r.o.</w:t>
             </w:r>
@@ -219,9 +216,6 @@
               <w:spacing w:after="20" w:line="250" w:lineRule="auto"/>
             </w:pPr>
             <w:r>
-              <w:rPr>
-                <w:rStyle w:val="AITOMAdresa"/>
-              </w:rPr>
               <w:t>Na Cihlářce 30</w:t>
             </w:r>
           </w:p>
@@ -230,9 +224,6 @@
               <w:spacing w:after="20" w:line="250" w:lineRule="auto"/>
             </w:pPr>
             <w:r>
-              <w:rPr>
-                <w:rStyle w:val="AITOMAdresa"/>
-              </w:rPr>
               <w:t>150 00 Praha 5</w:t>
             </w:r>
           </w:p>
@@ -241,9 +232,6 @@
               <w:spacing w:after="20" w:line="250" w:lineRule="auto"/>
             </w:pPr>
             <w:r>
-              <w:rPr>
-                <w:rStyle w:val="AITOMAdresa"/>
-              </w:rPr>
               <w:t>IČ: 24171816</w:t>
             </w:r>
           </w:p>
@@ -252,9 +240,6 @@
               <w:spacing w:after="20" w:line="250" w:lineRule="auto"/>
             </w:pPr>
             <w:r>
-              <w:rPr>
-                <w:rStyle w:val="AITOMAdresa"/>
-              </w:rPr>
               <w:t>DIČ: CZ24171816</w:t>
             </w:r>
           </w:p>
@@ -293,19 +278,16 @@
               <w:spacing w:after="60"/>
             </w:pPr>
             <w:r>
+              <w:t>OBJEDNATEL</w:t>
+            </w:r>
+          </w:p>
+          <w:p>
+            <w:pPr>
+              <w:spacing w:after="20" w:line="250" w:lineRule="auto"/>
+            </w:pPr>
+            <w:r>
               <w:rPr>
-                <w:rStyle w:val="AITOMLabelSvetly"/>
-              </w:rPr>
-              <w:t>OBJEDNATEL</w:t>
-            </w:r>
-          </w:p>
-          <w:p>
-            <w:pPr>
-              <w:spacing w:after="20" w:line="250" w:lineRule="auto"/>
-            </w:pPr>
-            <w:r>
-              <w:rPr>
-                <w:rStyle w:val="AITOMDuraz"/>
+                <w:rStyle w:val="AITOM-DrazSemiBold"/>
               </w:rPr>
               <w:t>[Název klienta]</w:t>
             </w:r>
@@ -315,9 +297,6 @@
               <w:spacing w:after="20" w:line="250" w:lineRule="auto"/>
             </w:pPr>
             <w:r>
-              <w:rPr>
-                <w:rStyle w:val="AITOMAdresa"/>
-              </w:rPr>
               <w:t>[Ulice a číslo]</w:t>
             </w:r>
           </w:p>
@@ -326,9 +305,6 @@
               <w:spacing w:after="20" w:line="250" w:lineRule="auto"/>
             </w:pPr>
             <w:r>
-              <w:rPr>
-                <w:rStyle w:val="AITOMAdresa"/>
-              </w:rPr>
               <w:t>[PSČ Město]</w:t>
             </w:r>
           </w:p>
@@ -337,9 +313,6 @@
               <w:spacing w:after="20" w:line="250" w:lineRule="auto"/>
             </w:pPr>
             <w:r>
-              <w:rPr>
-                <w:rStyle w:val="AITOMAdresa"/>
-              </w:rPr>
               <w:t>IČ: [xxxxxxxx]</w:t>
             </w:r>
           </w:p>
@@ -348,9 +321,6 @@
               <w:spacing w:after="20" w:line="250" w:lineRule="auto"/>
             </w:pPr>
             <w:r>
-              <w:rPr>
-                <w:rStyle w:val="AITOMAdresa"/>
-              </w:rPr>
               <w:t>DIČ: CZ[xxxxxxxx]</w:t>
             </w:r>
           </w:p>
@@ -359,7 +329,7 @@
     </w:tbl>
     <w:p>
       <w:pPr>
-        <w:pStyle w:val="AITOMNadpisSekce"/>
+        <w:pStyle w:val="AITOM-Nadpissekce"/>
       </w:pPr>
       <w:r>
         <w:t>Předmět objednávky</w:t>
@@ -375,7 +345,7 @@
     </w:p>
     <w:p>
       <w:pPr>
-        <w:pStyle w:val="AITOMNadpisSekce"/>
+        <w:pStyle w:val="AITOM-Nadpissekce"/>
       </w:pPr>
       <w:r>
         <w:t>Smluvní cena</w:t>
@@ -390,7 +360,8 @@
       </w:r>
       <w:r>
         <w:rPr>
-          <w:rStyle w:val="AITOMCastkaZvyraznena"/>
+          <w:rStyle w:val="AITOM-stkazvraznn"/>
+          <w:highlight w:val="none"/>
         </w:rPr>
         <w:t>0 Kč bez DPH</w:t>
       </w:r>
@@ -399,7 +370,8 @@
       </w:r>
       <w:r>
         <w:rPr>
-          <w:rStyle w:val="AITOMCastkaZvyraznena"/>
+          <w:rStyle w:val="AITOM-stkazvraznn"/>
+          <w:highlight w:val="none"/>
         </w:rPr>
         <w:t>0 Kč</w:t>
       </w:r>
@@ -409,7 +381,7 @@
     </w:p>
     <w:p>
       <w:pPr>
-        <w:pStyle w:val="AITOMNadpisSekce"/>
+        <w:pStyle w:val="AITOM-Nadpissekce"/>
       </w:pPr>
       <w:r>
         <w:t>Termín realizace</w:t>
@@ -434,7 +406,7 @@
     </w:p>
     <w:p>
       <w:pPr>
-        <w:pStyle w:val="AITOMNadpisSekce"/>
+        <w:pStyle w:val="AITOM-Nadpissekce"/>
       </w:pPr>
       <w:r>
         <w:t>Potvrzení objednávky a způsob fakturace</w:t>
@@ -445,7 +417,7 @@
         <w:spacing w:after="120" w:line="276" w:lineRule="auto"/>
       </w:pPr>
       <w:r>
-        <w:t xml:space="preserve">Potvrzení této objednávky bude provedeno jejím podpisem a úhradou první faktury objednatelem. Fakturace bude probíhat ve 2 fázích v níže uvedených termínech:</w:t>
+        <w:t>Potvrzení této objednávky bude provedeno jejím podpisem a úhradou první faktury objednatelem. Fakturace bude probíhat ve 2 fázích v níže uvedených termínech:</w:t>
       </w:r>
     </w:p>
     <w:p>
@@ -462,7 +434,8 @@
       </w:r>
       <w:r>
         <w:rPr>
-          <w:rStyle w:val="AITOMCastkaZvyraznena"/>
+          <w:rStyle w:val="AITOM-stkazvraznn"/>
+          <w:highlight w:val="none"/>
         </w:rPr>
         <w:t>0 Kč bez DPH</w:t>
       </w:r>
@@ -498,9 +471,9 @@
         <w:tblLook w:val="04A0" w:firstRow="1" w:lastRow="0" w:firstColumn="1" w:lastColumn="0" w:noHBand="0" w:noVBand="1"/>
       </w:tblPr>
       <w:tblGrid>
-        <w:gridCol w:w="4506"/>
+        <w:gridCol w:w="4459"/>
         <w:gridCol w:w="200"/>
-        <w:gridCol w:w="4894"/>
+        <w:gridCol w:w="4941"/>
       </w:tblGrid>
       <w:tr>
         <w:tc>
@@ -597,21 +570,18 @@
     </w:tbl>
     <w:p>
       <w:pPr>
-        <w:pStyle w:val="AITOMLabelSvetly"/>
+        <w:pStyle w:val="AITOM-Labelsvtlpozad"/>
         <w:pageBreakBefore/>
         <w:spacing w:after="40"/>
       </w:pPr>
       <w:r>
-        <w:rPr>
-          <w:rStyle w:val="AITOMLabelSvetly"/>
-        </w:rPr>
         <w:lastRenderedPageBreak/>
         <w:t>PŘÍLOHA Č. 1</w:t>
       </w:r>
     </w:p>
     <w:p>
       <w:pPr>
-        <w:pStyle w:val="AITOMNadpisPriloha"/>
+        <w:pStyle w:val="AITOM-Nadpisplohy"/>
       </w:pPr>
       <w:r>
         <w:t>Kalkulace tvorby webu</w:t>
@@ -622,7 +592,7 @@
         <w:spacing w:before="160" w:after="200"/>
       </w:pPr>
       <w:r>
-        <w:t xml:space="preserve">Lorem Ipsum odkaz bude doplněn</w:t>
+        <w:t>Lorem Ipsum odkaz bude doplněn</w:t>
       </w:r>
       <w:r>
         <w:rPr>
@@ -632,9 +602,9 @@
       </w:r>
       <w:r>
         <w:rPr>
-          <w:rStyle w:val="AITOMOdkaz"/>
+          <w:rStyle w:val="AITOM-Odkazmedium"/>
         </w:rPr>
-        <w:t xml:space="preserve">Wireframe webu</w:t>
+        <w:t>Wireframe webu</w:t>
       </w:r>
       <w:r>
         <w:rPr>
@@ -645,7 +615,7 @@
     </w:p>
     <w:p>
       <w:pPr>
-        <w:pStyle w:val="AITOMNadpisPodsekce"/>
+        <w:pStyle w:val="AITOM-Nadpispodsekce"/>
       </w:pPr>
       <w:r>
         <w:t>Kalkulace navrhovaného řešení</w:t>
@@ -696,9 +666,6 @@
           </w:tcPr>
           <w:p>
             <w:r>
-              <w:rPr>
-                <w:rStyle w:val="AITOMLabelTmavy"/>
-              </w:rPr>
               <w:t>POLOŽKA</w:t>
             </w:r>
           </w:p>
@@ -726,9 +693,6 @@
               <w:jc w:val="right"/>
             </w:pPr>
             <w:r>
-              <w:rPr>
-                <w:rStyle w:val="AITOMLabelTmavy"/>
-              </w:rPr>
               <w:t>CENA</w:t>
             </w:r>
           </w:p>
@@ -758,31 +722,31 @@
             </w:pPr>
             <w:r>
               <w:rPr>
-                <w:rStyle w:val="AITOMDuraz"/>
+                <w:rStyle w:val="AITOM-DrazSemiBold"/>
               </w:rPr>
               <w:t>Položka 1</w:t>
             </w:r>
           </w:p>
           <w:p>
             <w:pPr>
-              <w:pStyle w:val="AITOMOdrazkaSeznam"/>
+              <w:pStyle w:val="AITOM-Odrkaseznamvtabulce"/>
             </w:pPr>
             <w:r>
               <w:rPr>
-                <w:rStyle w:val="AITOMOdrazkaText"/>
+                <w:rStyle w:val="AITOM-Odrkatext"/>
               </w:rPr>
-              <w:t xml:space="preserve">subitem 1</w:t>
-            </w:r>
-          </w:p>
-          <w:p>
-            <w:pPr>
-              <w:pStyle w:val="AITOMOdrazkaSeznam"/>
+              <w:t>subitem 1</w:t>
+            </w:r>
+          </w:p>
+          <w:p>
+            <w:pPr>
+              <w:pStyle w:val="AITOM-Odrkaseznamvtabulce"/>
             </w:pPr>
             <w:r>
               <w:rPr>
-                <w:rStyle w:val="AITOMOdrazkaText"/>
+                <w:rStyle w:val="AITOM-Odrkatext"/>
               </w:rPr>
-              <w:t xml:space="preserve">subitem 2</w:t>
+              <w:t>subitem 2</w:t>
             </w:r>
           </w:p>
           <w:p>
@@ -820,7 +784,8 @@
             </w:pPr>
             <w:r>
               <w:rPr>
-                <w:rStyle w:val="AITOMCastkaZvyraznena"/>
+                <w:rStyle w:val="AITOM-stkazvraznn"/>
+                <w:highlight w:val="none"/>
               </w:rPr>
               <w:t>0 Kč</w:t>
             </w:r>
@@ -851,36 +816,36 @@
             </w:pPr>
             <w:r>
               <w:rPr>
-                <w:rStyle w:val="AITOMDuraz"/>
+                <w:rStyle w:val="AITOM-DrazSemiBold"/>
               </w:rPr>
               <w:t>Položka 2</w:t>
             </w:r>
           </w:p>
           <w:p>
             <w:pPr>
-              <w:pStyle w:val="AITOMOdrazkaSeznam"/>
+              <w:pStyle w:val="AITOM-Odrkaseznamvtabulce"/>
             </w:pPr>
             <w:r>
               <w:rPr>
-                <w:rStyle w:val="AITOMOdrazkaText"/>
+                <w:rStyle w:val="AITOM-Odrkatext"/>
               </w:rPr>
-              <w:t xml:space="preserve">subitem 1</w:t>
-            </w:r>
-          </w:p>
-          <w:p>
-            <w:pPr>
-              <w:pStyle w:val="AITOMOdrazkaSeznam"/>
+              <w:t>subitem 1</w:t>
+            </w:r>
+          </w:p>
+          <w:p>
+            <w:pPr>
+              <w:pStyle w:val="AITOM-Odrkaseznamvtabulce"/>
             </w:pPr>
             <w:r>
               <w:rPr>
-                <w:rStyle w:val="AITOMOdrazkaText"/>
+                <w:rStyle w:val="AITOM-Odrkatext"/>
               </w:rPr>
-              <w:t xml:space="preserve">subitem 2</w:t>
-            </w:r>
-          </w:p>
-          <w:p>
-            <w:pPr>
-              <w:pStyle w:val="AITOMOdrazkaPolozky"/>
+              <w:t>subitem 2</w:t>
+            </w:r>
+          </w:p>
+          <w:p>
+            <w:pPr>
+              <w:pStyle w:val="AITOM-Odrkapoloky"/>
             </w:pPr>
           </w:p>
         </w:tc>
@@ -907,7 +872,8 @@
             </w:pPr>
             <w:r>
               <w:rPr>
-                <w:rStyle w:val="AITOMCastkaZvyraznena"/>
+                <w:rStyle w:val="AITOM-stkazvraznn"/>
+                <w:highlight w:val="none"/>
               </w:rPr>
               <w:t>0 Kč</w:t>
             </w:r>
@@ -1077,7 +1043,7 @@
     </w:p>
     <w:p>
       <w:pPr>
-        <w:pStyle w:val="AITOMNadpisSekce"/>
+        <w:pStyle w:val="AITOM-Nadpissekce"/>
       </w:pPr>
       <w:r>
         <w:t>Harmonogram tvorby webu</w:t>
@@ -1088,18 +1054,18 @@
         <w:spacing w:after="120" w:line="276" w:lineRule="auto"/>
       </w:pPr>
       <w:r>
-        <w:t xml:space="preserve">Detailní harmonogram bude určen při podpisu objednávky tvorby webu. Nyní orientačně počítáme s tímto rozvržením prací (ukázkové položky, doplň dle reálného rozsahu):</w:t>
+        <w:t>Detailní harmonogram bude určen při podpisu objednávky tvorby webu. Nyní orientačně počítáme s tímto rozvržením prací (ukázkové položky, doplň dle reálného rozsahu):</w:t>
       </w:r>
     </w:p>
     <w:tbl>
       <w:tblPr>
-        <w:tblStyle w:val="AITOMTabulkaHarmonogram"/>
+        <w:tblStyle w:val="AITOM-Tabulkaharmonogram"/>
         <w:tblW w:w="9600" w:type="dxa"/>
         <w:tblLook w:val="04A0" w:firstRow="1" w:lastRow="0" w:firstColumn="1" w:lastColumn="0" w:noHBand="0" w:noVBand="1"/>
       </w:tblPr>
       <w:tblGrid>
-        <w:gridCol w:w="6600"/>
-        <w:gridCol w:w="3000"/>
+        <w:gridCol w:w="3618"/>
+        <w:gridCol w:w="5982"/>
       </w:tblGrid>
       <w:tr>
         <w:tc>
@@ -1109,12 +1075,9 @@
           </w:tcPr>
           <w:p>
             <w:pPr>
-              <w:pStyle w:val="AITOMLabelTmavy"/>
-            </w:pPr>
-            <w:r>
-              <w:rPr>
-                <w:rStyle w:val="AITOMLabelTmavy"/>
-              </w:rPr>
+              <w:pStyle w:val="AITOM-Labeltmavpozad"/>
+            </w:pPr>
+            <w:r>
               <w:t>PRÁCE</w:t>
             </w:r>
           </w:p>
@@ -1126,13 +1089,10 @@
           </w:tcPr>
           <w:p>
             <w:pPr>
-              <w:pStyle w:val="AITOMLabelTmavy"/>
+              <w:pStyle w:val="AITOM-Labeltmavpozad"/>
               <w:jc w:val="right"/>
             </w:pPr>
             <w:r>
-              <w:rPr>
-                <w:rStyle w:val="AITOMLabelTmavy"/>
-              </w:rPr>
               <w:t>DOBA TRVÁNÍ</w:t>
             </w:r>
           </w:p>
@@ -1145,7 +1105,7 @@
           </w:tcPr>
           <w:p>
             <w:pPr>
-              <w:pStyle w:val="AITOMHarmonogramPrace"/>
+              <w:pStyle w:val="AITOM-Harmonogramprce"/>
             </w:pPr>
             <w:r>
               <w:t>Práce 1</w:t>
@@ -1158,7 +1118,7 @@
           </w:tcPr>
           <w:p>
             <w:pPr>
-              <w:pStyle w:val="AITOMHarmonogramDoba"/>
+              <w:pStyle w:val="AITOM-Harmonogramdoba"/>
               <w:jc w:val="right"/>
             </w:pPr>
             <w:r>
@@ -1174,7 +1134,7 @@
           </w:tcPr>
           <w:p>
             <w:pPr>
-              <w:pStyle w:val="AITOMHarmonogramPrace"/>
+              <w:pStyle w:val="AITOM-Harmonogramprce"/>
             </w:pPr>
             <w:r>
               <w:t>Práce 2</w:t>
@@ -1187,7 +1147,7 @@
           </w:tcPr>
           <w:p>
             <w:pPr>
-              <w:pStyle w:val="AITOMHarmonogramDoba"/>
+              <w:pStyle w:val="AITOM-Harmonogramdoba"/>
               <w:jc w:val="right"/>
             </w:pPr>
             <w:r>
@@ -1203,7 +1163,7 @@
           </w:tcPr>
           <w:p>
             <w:pPr>
-              <w:pStyle w:val="AITOMHarmonogramPrace"/>
+              <w:pStyle w:val="AITOM-Harmonogramprce"/>
             </w:pPr>
             <w:r>
               <w:t>Práce 3</w:t>
@@ -1216,7 +1176,7 @@
           </w:tcPr>
           <w:p>
             <w:pPr>
-              <w:pStyle w:val="AITOMHarmonogramDoba"/>
+              <w:pStyle w:val="AITOM-Harmonogramdoba"/>
               <w:jc w:val="right"/>
             </w:pPr>
             <w:r>
@@ -1232,7 +1192,7 @@
           </w:tcPr>
           <w:p>
             <w:pPr>
-              <w:pStyle w:val="AITOMHarmonogramPrace"/>
+              <w:pStyle w:val="AITOM-Harmonogramprce"/>
             </w:pPr>
             <w:r>
               <w:t>Práce 4</w:t>
@@ -1245,7 +1205,7 @@
           </w:tcPr>
           <w:p>
             <w:pPr>
-              <w:pStyle w:val="AITOMHarmonogramDoba"/>
+              <w:pStyle w:val="AITOM-Harmonogramdoba"/>
               <w:jc w:val="right"/>
             </w:pPr>
             <w:r>
@@ -1261,7 +1221,7 @@
           </w:tcPr>
           <w:p>
             <w:pPr>
-              <w:pStyle w:val="AITOMHarmonogramPrace"/>
+              <w:pStyle w:val="AITOM-Harmonogramprce"/>
             </w:pPr>
             <w:r>
               <w:t>Práce 5</w:t>
@@ -1274,7 +1234,7 @@
           </w:tcPr>
           <w:p>
             <w:pPr>
-              <w:pStyle w:val="AITOMHarmonogramDoba"/>
+              <w:pStyle w:val="AITOM-Harmonogramdoba"/>
               <w:jc w:val="right"/>
             </w:pPr>
             <w:r>
@@ -1298,9 +1258,21 @@
       </w:pPr>
       <w:r>
         <w:rPr>
-          <w:rStyle w:val="AITOMOdkaz"/>
+          <w:rStyle w:val="AITOM-Odkazmedium"/>
         </w:rPr>
-        <w:t>Obecné podmínky spolupráce při tvorbě webu jsou uvedeny v Příloze č. 1.</w:t>
+        <w:t xml:space="preserve">Obecné podmínky spolupráce při tvorbě webu jsou uvedeny v Příloze č. </w:t>
+      </w:r>
+      <w:r>
+        <w:rPr>
+          <w:rStyle w:val="AITOM-Odkazmedium"/>
+        </w:rPr>
+        <w:t>2</w:t>
+      </w:r>
+      <w:r>
+        <w:rPr>
+          <w:rStyle w:val="AITOM-Odkazmedium"/>
+        </w:rPr>
+        <w:t>.</w:t>
       </w:r>
     </w:p>
     <w:sectPr>
@@ -1521,6 +1493,7 @@
     <w:lvl w:ilvl="0" w:tplc="A0427A74">
       <w:start w:val="1"/>
       <w:numFmt w:val="bullet"/>
+      <w:pStyle w:val="AITOM-Odrkaseznamvtabulce"/>
       <w:lvlText w:val="–"/>
       <w:lvlJc w:val="left"/>
       <w:pPr>
@@ -2197,14 +2170,14 @@
       <w:szCs w:val="20"/>
     </w:rPr>
   </w:style>
-  <w:style w:type="paragraph" w:customStyle="1" w:styleId="AITOMNadpisSekce">
+  <w:style w:type="paragraph" w:customStyle="1" w:styleId="AITOM-Nadpissekce">
     <w:name w:val="AITOM - Nadpis sekce"/>
     <w:basedOn w:val="Normln"/>
     <w:qFormat/>
     <w:pPr>
       <w:keepNext/>
       <w:pBdr>
-        <w:bottom w:val="single" w:sz="14" w:space="6" w:color="4CE500"/>
+        <w:bottom w:val="single" w:sz="14" w:space="6" w:color="C9CBC9"/>
       </w:pBdr>
       <w:spacing w:before="340" w:after="140"/>
     </w:pPr>
@@ -2214,13 +2187,13 @@
       <w:szCs w:val="30"/>
     </w:rPr>
   </w:style>
-  <w:style w:type="paragraph" w:customStyle="1" w:styleId="AITOMNadpisPriloha">
+  <w:style w:type="paragraph" w:customStyle="1" w:styleId="AITOM-Nadpisplohy">
     <w:name w:val="AITOM - Nadpis přílohy"/>
     <w:basedOn w:val="Normln"/>
     <w:qFormat/>
     <w:pPr>
       <w:pBdr>
-        <w:bottom w:val="single" w:sz="14" w:space="6" w:color="4CE500"/>
+        <w:bottom w:val="single" w:sz="14" w:space="6" w:color="C9CBC9"/>
       </w:pBdr>
       <w:spacing w:after="60"/>
     </w:pPr>
@@ -2232,7 +2205,7 @@
       <w:szCs w:val="40"/>
     </w:rPr>
   </w:style>
-  <w:style w:type="paragraph" w:customStyle="1" w:styleId="AITOMNadpisPodsekce">
+  <w:style w:type="paragraph" w:customStyle="1" w:styleId="AITOM-Nadpispodsekce">
     <w:name w:val="AITOM - Nadpis podsekce"/>
     <w:basedOn w:val="Normln"/>
     <w:qFormat/>
@@ -2246,7 +2219,7 @@
       <w:szCs w:val="23"/>
     </w:rPr>
   </w:style>
-  <w:style w:type="paragraph" w:customStyle="1" w:styleId="AITOMLabelSvetly">
+  <w:style w:type="paragraph" w:customStyle="1" w:styleId="AITOM-Labelsvtlpozad">
     <w:name w:val="AITOM - Label světlé pozadí"/>
     <w:basedOn w:val="Normln"/>
     <w:qFormat/>
@@ -2258,7 +2231,7 @@
       <w:szCs w:val="15"/>
     </w:rPr>
   </w:style>
-  <w:style w:type="paragraph" w:customStyle="1" w:styleId="AITOMLabelTmavy">
+  <w:style w:type="paragraph" w:customStyle="1" w:styleId="AITOM-Labeltmavpozad">
     <w:name w:val="AITOM - Label tmavé pozadí"/>
     <w:basedOn w:val="Normln"/>
     <w:qFormat/>
@@ -2270,7 +2243,7 @@
       <w:szCs w:val="19"/>
     </w:rPr>
   </w:style>
-  <w:style w:type="paragraph" w:customStyle="1" w:styleId="AITOMAdresa">
+  <w:style w:type="paragraph" w:customStyle="1" w:styleId="AITOM-Adresndek">
     <w:name w:val="AITOM - Adresní řádek"/>
     <w:basedOn w:val="Normln"/>
     <w:qFormat/>
@@ -2280,7 +2253,7 @@
       <w:szCs w:val="19"/>
     </w:rPr>
   </w:style>
-  <w:style w:type="paragraph" w:customStyle="1" w:styleId="AITOMOdrazkaPolozky">
+  <w:style w:type="paragraph" w:customStyle="1" w:styleId="AITOM-Odrkapoloky">
     <w:name w:val="AITOM - Odrážka položky"/>
     <w:basedOn w:val="Normln"/>
     <w:qFormat/>
@@ -2289,7 +2262,7 @@
       <w:ind w:left="170" w:hanging="170"/>
     </w:pPr>
   </w:style>
-  <w:style w:type="character" w:customStyle="1" w:styleId="AITOMDuraz">
+  <w:style w:type="character" w:customStyle="1" w:styleId="AITOM-DrazSemiBold">
     <w:name w:val="AITOM - Důraz SemiBold"/>
     <w:basedOn w:val="Standardnpsmoodstavce"/>
     <w:qFormat/>
@@ -2297,16 +2270,16 @@
       <w:rFonts w:ascii="Inter SemiBold" w:eastAsia="Inter SemiBold" w:hAnsi="Inter SemiBold" w:cs="Inter SemiBold"/>
     </w:rPr>
   </w:style>
-  <w:style w:type="character" w:customStyle="1" w:styleId="AITOMCastkaZvyraznena">
+  <w:style w:type="character" w:customStyle="1" w:styleId="AITOM-stkazvraznn">
     <w:name w:val="AITOM - Částka zvýrazněná"/>
-    <w:basedOn w:val="AITOMDuraz"/>
+    <w:basedOn w:val="AITOM-DrazSemiBold"/>
     <w:qFormat/>
     <w:rPr>
       <w:rFonts w:ascii="Inter SemiBold" w:eastAsia="Inter SemiBold" w:hAnsi="Inter SemiBold" w:cs="Inter SemiBold"/>
       <w:highlight w:val="yellow"/>
     </w:rPr>
   </w:style>
-  <w:style w:type="character" w:customStyle="1" w:styleId="AITOMOdrazkaZnacka">
+  <w:style w:type="character" w:customStyle="1" w:styleId="AITOM-Odrkaznaka">
     <w:name w:val="AITOM - Odrážka značka"/>
     <w:basedOn w:val="Standardnpsmoodstavce"/>
     <w:qFormat/>
@@ -2316,7 +2289,7 @@
       <w:szCs w:val="17"/>
     </w:rPr>
   </w:style>
-  <w:style w:type="character" w:customStyle="1" w:styleId="AITOMOdrazkaText">
+  <w:style w:type="character" w:customStyle="1" w:styleId="AITOM-Odrkatext">
     <w:name w:val="AITOM - Odrážka text"/>
     <w:basedOn w:val="Standardnpsmoodstavce"/>
     <w:qFormat/>
@@ -2326,7 +2299,7 @@
       <w:szCs w:val="17"/>
     </w:rPr>
   </w:style>
-  <w:style w:type="character" w:customStyle="1" w:styleId="AITOMOdkaz">
+  <w:style w:type="character" w:customStyle="1" w:styleId="AITOM-Odkazmedium">
     <w:name w:val="AITOM - Odkaz (medium)"/>
     <w:basedOn w:val="Standardnpsmoodstavce"/>
     <w:qFormat/>
@@ -2334,13 +2307,12 @@
       <w:rFonts w:ascii="Inter Medium" w:eastAsia="Inter Medium" w:hAnsi="Inter Medium" w:cs="Inter Medium"/>
     </w:rPr>
   </w:style>
-  <w:style w:type="paragraph" w:customStyle="1" w:styleId="AITOMOdrazkaSeznam">
+  <w:style w:type="paragraph" w:customStyle="1" w:styleId="AITOM-Odrkaseznamvtabulce">
     <w:name w:val="AITOM - Odrážka (seznam v tabulce)"/>
     <w:basedOn w:val="Odstavecseseznamem"/>
     <w:qFormat/>
     <w:pPr>
       <w:numPr>
-        <w:ilvl w:val="0"/>
         <w:numId w:val="2"/>
       </w:numPr>
       <w:spacing w:after="26"/>
@@ -2351,7 +2323,7 @@
       <w:szCs w:val="17"/>
     </w:rPr>
   </w:style>
-  <w:style w:type="table" w:customStyle="1" w:styleId="AITOMTabulkaHarmonogram">
+  <w:style w:type="table" w:customStyle="1" w:styleId="AITOM-Tabulkaharmonogram">
     <w:name w:val="AITOM - Tabulka harmonogram"/>
     <w:basedOn w:val="Normlntabulka"/>
     <w:qFormat/>
@@ -2371,7 +2343,7 @@
       </w:tcMar>
     </w:tcPr>
   </w:style>
-  <w:style w:type="paragraph" w:customStyle="1" w:styleId="AITOMHarmonogramPrace">
+  <w:style w:type="paragraph" w:customStyle="1" w:styleId="AITOM-Harmonogramprce">
     <w:name w:val="AITOM - Harmonogram práce"/>
     <w:basedOn w:val="Normln"/>
     <w:qFormat/>
@@ -2379,7 +2351,7 @@
       <w:rFonts w:ascii="Inter SemiBold" w:eastAsia="Inter SemiBold" w:hAnsi="Inter SemiBold" w:cs="Inter SemiBold"/>
     </w:rPr>
   </w:style>
-  <w:style w:type="paragraph" w:customStyle="1" w:styleId="AITOMHarmonogramDoba">
+  <w:style w:type="paragraph" w:customStyle="1" w:styleId="AITOM-Harmonogramdoba">
     <w:name w:val="AITOM - Harmonogram doba"/>
     <w:basedOn w:val="Normln"/>
     <w:qFormat/>

</xml_diff>

<commit_message>
Adjust kalkulace table header color
Co-Authored-By: Claude Sonnet 5 <noreply@anthropic.com>
</commit_message>
<xml_diff>
--- a/docs/templates/objednavka/vzor-objednavka.docx
+++ b/docs/templates/objednavka/vzor-objednavka.docx
@@ -666,6 +666,9 @@
           </w:tcPr>
           <w:p>
             <w:r>
+              <w:rPr>
+                <w:color w:val="FFFFFF" w:themeColor="background1"/>
+              </w:rPr>
               <w:t>POLOŽKA</w:t>
             </w:r>
           </w:p>
@@ -693,6 +696,9 @@
               <w:jc w:val="right"/>
             </w:pPr>
             <w:r>
+              <w:rPr>
+                <w:color w:val="FFFFFF" w:themeColor="background1"/>
+              </w:rPr>
               <w:t>CENA</w:t>
             </w:r>
           </w:p>

</xml_diff>

<commit_message>
Underline links in objednavka template
Adds single underline to the AITOM - Odkaz (medium) character style so
links (e.g. "Wireframe webu") read visually as links. Also detached
two non-link runs in the "Obecné podmínky..." callout that had been
reusing the same style just for its Inter Medium font weight, so they
don't pick up the underline too.

Co-Authored-By: Claude Sonnet 5 <noreply@anthropic.com>
</commit_message>
<xml_diff>
--- a/docs/templates/objednavka/vzor-objednavka.docx
+++ b/docs/templates/objednavka/vzor-objednavka.docx
@@ -1264,19 +1264,19 @@
       </w:pPr>
       <w:r>
         <w:rPr>
-          <w:rStyle w:val="AITOM-Odkazmedium"/>
+          <w:rFonts w:ascii="Inter Medium" w:eastAsia="Inter Medium" w:hAnsi="Inter Medium" w:cs="Inter Medium"/>
         </w:rPr>
         <w:t xml:space="preserve">Obecné podmínky spolupráce při tvorbě webu jsou uvedeny v Příloze č. </w:t>
       </w:r>
       <w:r>
         <w:rPr>
-          <w:rStyle w:val="AITOM-Odkazmedium"/>
+          <w:rFonts w:ascii="Inter Medium" w:eastAsia="Inter Medium" w:hAnsi="Inter Medium" w:cs="Inter Medium"/>
         </w:rPr>
         <w:t>2</w:t>
       </w:r>
       <w:r>
         <w:rPr>
-          <w:rStyle w:val="AITOM-Odkazmedium"/>
+          <w:rFonts w:ascii="Inter Medium" w:eastAsia="Inter Medium" w:hAnsi="Inter Medium" w:cs="Inter Medium"/>
         </w:rPr>
         <w:t>.</w:t>
       </w:r>
@@ -2311,6 +2311,7 @@
     <w:qFormat/>
     <w:rPr>
       <w:rFonts w:ascii="Inter Medium" w:eastAsia="Inter Medium" w:hAnsi="Inter Medium" w:cs="Inter Medium"/>
+      <w:u w:val="single"/>
     </w:rPr>
   </w:style>
   <w:style w:type="paragraph" w:customStyle="1" w:styleId="AITOM-Odrkaseznamvtabulce">

</xml_diff>

<commit_message>
Manual edit to objednavka template
Co-Authored-By: Claude Sonnet 5 <noreply@anthropic.com>
</commit_message>
<xml_diff>
--- a/docs/templates/objednavka/vzor-objednavka.docx
+++ b/docs/templates/objednavka/vzor-objednavka.docx
@@ -1060,7 +1060,13 @@
         <w:spacing w:after="120" w:line="276" w:lineRule="auto"/>
       </w:pPr>
       <w:r>
-        <w:t>Detailní harmonogram bude určen při podpisu objednávky tvorby webu. Nyní orientačně počítáme s tímto rozvržením prací (ukázkové položky, doplň dle reálného rozsahu):</w:t>
+        <w:t>P</w:t>
+      </w:r>
+      <w:r>
+        <w:t>očítáme s tímto rozvržením</w:t>
+      </w:r>
+      <w:r>
+        <w:t xml:space="preserve"> prací.</w:t>
       </w:r>
     </w:p>
     <w:tbl>

</xml_diff>

<commit_message>
Lighten CELKOVA CENA row background, require asking about all missing template sections
- Replaces the saturated cyber-green table shading (#4CE500) on the
  CELKOVA CENA row with a muted light-green tint (#E4F9D8) to match a
  proposed reference color - the saturated fill read too much like a
  CTA accent for a repeated table row.
- README: generalizes the intake-question rule so the AI checks every
  section present in the template (not just the fixed required-fields
  list) and asks about any section the user's input doesn't cover.

Co-Authored-By: Claude Sonnet 5 <noreply@anthropic.com>
</commit_message>
<xml_diff>
--- a/docs/templates/objednavka/vzor-objednavka.docx
+++ b/docs/templates/objednavka/vzor-objednavka.docx
@@ -896,7 +896,7 @@
               <w:bottom w:val="none" w:sz="0" w:space="0" w:color="FFFFFF"/>
               <w:right w:val="none" w:sz="0" w:space="0" w:color="FFFFFF"/>
             </w:tcBorders>
-            <w:shd w:val="clear" w:color="auto" w:fill="4CE500"/>
+            <w:shd w:val="clear" w:color="auto" w:fill="E4F9D8"/>
             <w:tcMar>
               <w:top w:w="170" w:type="dxa"/>
               <w:left w:w="200" w:type="dxa"/>
@@ -927,7 +927,7 @@
               <w:bottom w:val="none" w:sz="0" w:space="0" w:color="FFFFFF"/>
               <w:right w:val="none" w:sz="0" w:space="0" w:color="FFFFFF"/>
             </w:tcBorders>
-            <w:shd w:val="clear" w:color="auto" w:fill="4CE500"/>
+            <w:shd w:val="clear" w:color="auto" w:fill="E4F9D8"/>
             <w:tcMar>
               <w:top w:w="170" w:type="dxa"/>
               <w:left w:w="200" w:type="dxa"/>

</xml_diff>